<commit_message>
feat(gactapp): opening-brief on the shared model (the answering brief's layout, its own title; certificate of service a contents heading, its closing words kept with the signature); hand-written docx filter replaced by generated latex and docx; latex and docx 352/352, gated (fb-595.54.59)
Co-Authored-By: Claude Opus 5.5 <noreply@anthropic.com>
</commit_message>
<xml_diff>
--- a/courts/eleventh-circuit/georgia/state/court-of-appeals/opening-brief/usage/OUTPUT-opening-brief.docx
+++ b/courts/eleventh-circuit/georgia/state/court-of-appeals/opening-brief/usage/OUTPUT-opening-brief.docx
@@ -370,6 +370,7 @@
       <w:pPr>
         <w:spacing w:before="1440" w:after="0" w:line="322" w:lineRule="exact"/>
         <w:ind w:left="4608" w:firstLine="0"/>
+        <w:jc w:val="left"/>
       </w:pPr>
       <w:r>
         <w:rPr>
@@ -425,6 +426,7 @@
       <w:pPr>
         <w:spacing w:before="160" w:after="0" w:line="322" w:lineRule="exact"/>
         <w:ind w:left="4608" w:firstLine="0"/>
+        <w:jc w:val="left"/>
       </w:pPr>
       <w:r>
         <w:rPr>
@@ -466,6 +468,7 @@
       <w:pPr>
         <w:spacing w:before="0" w:after="0" w:line="322" w:lineRule="exact"/>
         <w:ind w:left="4608" w:firstLine="0"/>
+        <w:jc w:val="left"/>
       </w:pPr>
       <w:r>
         <w:t xml:space="preserve">Georgia</w:t>
@@ -493,6 +496,7 @@
       <w:pPr>
         <w:spacing w:before="160" w:after="0" w:line="322" w:lineRule="exact"/>
         <w:ind w:left="4608" w:firstLine="0"/>
+        <w:jc w:val="left"/>
       </w:pPr>
       <w:r>
         <w:rPr>
@@ -548,6 +552,7 @@
       <w:pPr>
         <w:spacing w:before="0" w:after="0" w:line="322" w:lineRule="exact"/>
         <w:ind w:left="4608" w:firstLine="0"/>
+        <w:jc w:val="left"/>
       </w:pPr>
       <w:r>
         <w:t xml:space="preserve">Georgia</w:t>
@@ -575,6 +580,7 @@
       <w:pPr>
         <w:spacing w:before="160" w:after="0" w:line="322" w:lineRule="exact"/>
         <w:ind w:left="4608" w:firstLine="0"/>
+        <w:jc w:val="left"/>
       </w:pPr>
       <w:r>
         <w:rPr>
@@ -616,6 +622,7 @@
       <w:pPr>
         <w:spacing w:before="0" w:after="0" w:line="322" w:lineRule="exact"/>
         <w:ind w:left="4608" w:firstLine="0"/>
+        <w:jc w:val="left"/>
       </w:pPr>
       <w:r>
         <w:t xml:space="preserve">Georgia</w:t>
@@ -643,6 +650,7 @@
       <w:pPr>
         <w:spacing w:before="0" w:after="0" w:line="322" w:lineRule="exact"/>
         <w:ind w:left="4608" w:firstLine="0"/>
+        <w:jc w:val="left"/>
       </w:pPr>
       <w:r>
         <w:rPr>
@@ -684,6 +692,7 @@
       <w:pPr>
         <w:spacing w:before="0" w:after="0" w:line="322" w:lineRule="exact"/>
         <w:ind w:left="4608" w:firstLine="0"/>
+        <w:jc w:val="left"/>
       </w:pPr>
       <w:r>
         <w:t xml:space="preserve">304</w:t>
@@ -711,6 +720,7 @@
       <w:pPr>
         <w:spacing w:before="0" w:after="0" w:line="322" w:lineRule="exact"/>
         <w:ind w:left="4608" w:firstLine="0"/>
+        <w:jc w:val="left"/>
       </w:pPr>
       <w:r>
         <w:t xml:space="preserve">Valdosta,</w:t>
@@ -732,6 +742,7 @@
       <w:pPr>
         <w:spacing w:before="0" w:after="0" w:line="322" w:lineRule="exact"/>
         <w:ind w:left="4608" w:firstLine="0"/>
+        <w:jc w:val="left"/>
       </w:pPr>
       <w:r>
         <w:t xml:space="preserve">(229)</w:t>
@@ -741,11 +752,7 @@
       </w:r>
       <w:r>
         <w:t xml:space="preserve">247</w:t>
-      </w:r>
-      <w:r>
         <w:noBreakHyphen/>
-      </w:r>
-      <w:r>
         <w:t xml:space="preserve">0386</w:t>
       </w:r>
     </w:p>
@@ -753,6 +760,7 @@
       <w:pPr>
         <w:spacing w:before="0" w:after="0" w:line="322" w:lineRule="exact"/>
         <w:ind w:left="4608" w:firstLine="0"/>
+        <w:jc w:val="left"/>
       </w:pPr>
       <w:r>
         <w:t xml:space="preserve">petermanlawoffice@yahoo.com</w:t>
@@ -762,6 +770,7 @@
       <w:pPr>
         <w:spacing w:before="0" w:after="0" w:line="322" w:lineRule="exact"/>
         <w:ind w:left="4608" w:firstLine="0"/>
+        <w:jc w:val="left"/>
       </w:pPr>
       <w:r>
         <w:t xml:space="preserve">mburke.petermanlaw@gmail.com</w:t>
@@ -771,6 +780,7 @@
       <w:pPr>
         <w:spacing w:before="0" w:after="0" w:line="322" w:lineRule="exact"/>
         <w:ind w:left="4608" w:firstLine="0"/>
+        <w:jc w:val="left"/>
       </w:pPr>
       <w:r>
         <w:t xml:space="preserve">sddelk.petermanlaw@gmail.com</w:t>
@@ -779,7 +789,14 @@
     <w:p>
       <w:pPr>
         <w:pageBreakBefore/>
-        <w:spacing w:before="0" w:after="322" w:line="322" w:lineRule="exact"/>
+        <w:spacing w:before="0" w:after="0" w:line="1" w:lineRule="exact"/>
+      </w:pPr>
+    </w:p>
+    <w:p>
+      <w:pPr>
+        <w:keepNext/>
+        <w:keepLines/>
+        <w:spacing w:before="0" w:after="320" w:line="322" w:lineRule="exact"/>
         <w:ind w:left="0" w:firstLine="0"/>
         <w:jc w:val="center"/>
       </w:pPr>
@@ -829,7 +846,7 @@
         <w:ind w:left="720" w:right="720" w:hanging="720"/>
       </w:pPr>
       <w:r>
-        <w:t xml:space="preserve">Table</w:t>
+        <w:t xml:space="preserve">Introduction</w:t>
       </w:r>
       <w:r>
         <w:t xml:space="preserve"> </w:t>
@@ -841,7 +858,31 @@
         <w:t xml:space="preserve"> </w:t>
       </w:r>
       <w:r>
-        <w:t xml:space="preserve">Authorities</w:t>
+        <w:t xml:space="preserve">Issues</w:t>
+      </w:r>
+      <w:r>
+        <w:t xml:space="preserve"> </w:t>
+      </w:r>
+      <w:r>
+        <w:t xml:space="preserve">and</w:t>
+      </w:r>
+      <w:r>
+        <w:t xml:space="preserve"> </w:t>
+      </w:r>
+      <w:r>
+        <w:t xml:space="preserve">Arguments</w:t>
+      </w:r>
+      <w:r>
+        <w:t xml:space="preserve"> </w:t>
+      </w:r>
+      <w:r>
+        <w:t xml:space="preserve">on</w:t>
+      </w:r>
+      <w:r>
+        <w:t xml:space="preserve"> </w:t>
+      </w:r>
+      <w:r>
+        <w:t xml:space="preserve">Appeal</w:t>
       </w:r>
       <w:r>
         <w:t xml:space="preserve">   </w:t>
@@ -850,7 +891,7 @@
         <w:tab/>
       </w:r>
       <w:r>
-        <w:t xml:space="preserve">3</w:t>
+        <w:t xml:space="preserve">4</w:t>
       </w:r>
     </w:p>
     <w:p>
@@ -863,43 +904,13 @@
         <w:ind w:left="720" w:right="720" w:hanging="720"/>
       </w:pPr>
       <w:r>
-        <w:t xml:space="preserve">Introduction</w:t>
-      </w:r>
-      <w:r>
-        <w:t xml:space="preserve"> </w:t>
-      </w:r>
-      <w:r>
-        <w:t xml:space="preserve">of</w:t>
-      </w:r>
-      <w:r>
-        <w:t xml:space="preserve"> </w:t>
-      </w:r>
-      <w:r>
-        <w:t xml:space="preserve">Issues</w:t>
-      </w:r>
-      <w:r>
-        <w:t xml:space="preserve"> </w:t>
-      </w:r>
-      <w:r>
-        <w:t xml:space="preserve">and</w:t>
-      </w:r>
-      <w:r>
-        <w:t xml:space="preserve"> </w:t>
-      </w:r>
-      <w:r>
-        <w:t xml:space="preserve">Arguments</w:t>
-      </w:r>
-      <w:r>
-        <w:t xml:space="preserve"> </w:t>
-      </w:r>
-      <w:r>
-        <w:t xml:space="preserve">on</w:t>
-      </w:r>
-      <w:r>
-        <w:t xml:space="preserve"> </w:t>
-      </w:r>
-      <w:r>
-        <w:t xml:space="preserve">Appeal</w:t>
+        <w:t xml:space="preserve">Jurisdictional</w:t>
+      </w:r>
+      <w:r>
+        <w:t xml:space="preserve"> </w:t>
+      </w:r>
+      <w:r>
+        <w:t xml:space="preserve">Statement</w:t>
       </w:r>
       <w:r>
         <w:t xml:space="preserve">   </w:t>
@@ -921,13 +932,19 @@
         <w:ind w:left="720" w:right="720" w:hanging="720"/>
       </w:pPr>
       <w:r>
-        <w:t xml:space="preserve">Jurisdictional</w:t>
-      </w:r>
-      <w:r>
-        <w:t xml:space="preserve"> </w:t>
-      </w:r>
-      <w:r>
-        <w:t xml:space="preserve">Statement</w:t>
+        <w:t xml:space="preserve">Enumeration</w:t>
+      </w:r>
+      <w:r>
+        <w:t xml:space="preserve"> </w:t>
+      </w:r>
+      <w:r>
+        <w:t xml:space="preserve">of</w:t>
+      </w:r>
+      <w:r>
+        <w:t xml:space="preserve"> </w:t>
+      </w:r>
+      <w:r>
+        <w:t xml:space="preserve">Errors</w:t>
       </w:r>
       <w:r>
         <w:t xml:space="preserve">   </w:t>
@@ -949,7 +966,7 @@
         <w:ind w:left="720" w:right="720" w:hanging="720"/>
       </w:pPr>
       <w:r>
-        <w:t xml:space="preserve">Enumeration</w:t>
+        <w:t xml:space="preserve">Statement</w:t>
       </w:r>
       <w:r>
         <w:t xml:space="preserve"> </w:t>
@@ -961,7 +978,13 @@
         <w:t xml:space="preserve"> </w:t>
       </w:r>
       <w:r>
-        <w:t xml:space="preserve">Errors</w:t>
+        <w:t xml:space="preserve">the</w:t>
+      </w:r>
+      <w:r>
+        <w:t xml:space="preserve"> </w:t>
+      </w:r>
+      <w:r>
+        <w:t xml:space="preserve">Case</w:t>
       </w:r>
       <w:r>
         <w:t xml:space="preserve">   </w:t>
@@ -983,7 +1006,19 @@
         <w:ind w:left="720" w:right="720" w:hanging="720"/>
       </w:pPr>
       <w:r>
-        <w:t xml:space="preserve">Statement</w:t>
+        <w:t xml:space="preserve">Argument</w:t>
+      </w:r>
+      <w:r>
+        <w:t xml:space="preserve"> </w:t>
+      </w:r>
+      <w:r>
+        <w:t xml:space="preserve">and</w:t>
+      </w:r>
+      <w:r>
+        <w:t xml:space="preserve"> </w:t>
+      </w:r>
+      <w:r>
+        <w:t xml:space="preserve">Citation</w:t>
       </w:r>
       <w:r>
         <w:t xml:space="preserve"> </w:t>
@@ -995,13 +1030,193 @@
         <w:t xml:space="preserve"> </w:t>
       </w:r>
       <w:r>
+        <w:t xml:space="preserve">Authority</w:t>
+      </w:r>
+      <w:r>
+        <w:t xml:space="preserve">   </w:t>
+      </w:r>
+      <w:r>
+        <w:tab/>
+      </w:r>
+      <w:r>
+        <w:t xml:space="preserve">8</w:t>
+      </w:r>
+    </w:p>
+    <w:p>
+      <w:pPr>
+        <w:keepLines/>
+        <w:tabs>
+          <w:tab w:val="right" w:leader="dot" w:pos="9360"/>
+        </w:tabs>
+        <w:spacing w:before="160" w:after="0" w:line="322" w:lineRule="exact"/>
+        <w:ind w:left="1440" w:right="720" w:hanging="720"/>
+      </w:pPr>
+      <w:r>
+        <w:t xml:space="preserve">A.</w:t>
+      </w:r>
+      <w:r>
+        <w:t xml:space="preserve"> </w:t>
+      </w:r>
+      <w:r>
+        <w:t xml:space="preserve">The</w:t>
+      </w:r>
+      <w:r>
+        <w:t xml:space="preserve"> </w:t>
+      </w:r>
+      <w:r>
+        <w:t xml:space="preserve">Standard</w:t>
+      </w:r>
+      <w:r>
+        <w:t xml:space="preserve"> </w:t>
+      </w:r>
+      <w:r>
+        <w:t xml:space="preserve">of</w:t>
+      </w:r>
+      <w:r>
+        <w:t xml:space="preserve"> </w:t>
+      </w:r>
+      <w:r>
+        <w:t xml:space="preserve">Review</w:t>
+      </w:r>
+      <w:r>
+        <w:t xml:space="preserve">   </w:t>
+      </w:r>
+      <w:r>
+        <w:tab/>
+      </w:r>
+      <w:r>
+        <w:t xml:space="preserve">8</w:t>
+      </w:r>
+    </w:p>
+    <w:p>
+      <w:pPr>
+        <w:keepLines/>
+        <w:tabs>
+          <w:tab w:val="right" w:leader="dot" w:pos="9360"/>
+        </w:tabs>
+        <w:spacing w:before="160" w:after="0" w:line="322" w:lineRule="exact"/>
+        <w:ind w:left="1440" w:right="720" w:hanging="720"/>
+      </w:pPr>
+      <w:r>
+        <w:t xml:space="preserve">B.</w:t>
+      </w:r>
+      <w:r>
+        <w:t xml:space="preserve"> </w:t>
+      </w:r>
+      <w:r>
+        <w:t xml:space="preserve">The</w:t>
+      </w:r>
+      <w:r>
+        <w:t xml:space="preserve"> </w:t>
+      </w:r>
+      <w:r>
+        <w:t xml:space="preserve">Trial</w:t>
+      </w:r>
+      <w:r>
+        <w:t xml:space="preserve"> </w:t>
+      </w:r>
+      <w:r>
+        <w:t xml:space="preserve">Court</w:t>
+      </w:r>
+      <w:r>
+        <w:t xml:space="preserve"> </w:t>
+      </w:r>
+      <w:r>
+        <w:t xml:space="preserve">Erred</w:t>
+      </w:r>
+      <w:r>
+        <w:t xml:space="preserve"> </w:t>
+      </w:r>
+      <w:r>
+        <w:t xml:space="preserve">in</w:t>
+      </w:r>
+      <w:r>
+        <w:t xml:space="preserve"> </w:t>
+      </w:r>
+      <w:r>
+        <w:t xml:space="preserve">Granting</w:t>
+      </w:r>
+      <w:r>
+        <w:t xml:space="preserve"> </w:t>
+      </w:r>
+      <w:r>
+        <w:t xml:space="preserve">Summary</w:t>
+      </w:r>
+      <w:r>
+        <w:t xml:space="preserve"> </w:t>
+      </w:r>
+      <w:r>
+        <w:t xml:space="preserve">Judgment</w:t>
+      </w:r>
+      <w:r>
+        <w:t xml:space="preserve">   </w:t>
+      </w:r>
+      <w:r>
+        <w:tab/>
+      </w:r>
+      <w:r>
+        <w:t xml:space="preserve">9</w:t>
+      </w:r>
+    </w:p>
+    <w:p>
+      <w:pPr>
+        <w:keepLines/>
+        <w:tabs>
+          <w:tab w:val="right" w:leader="dot" w:pos="9360"/>
+        </w:tabs>
+        <w:spacing w:before="160" w:after="0" w:line="322" w:lineRule="exact"/>
+        <w:ind w:left="2160" w:right="720" w:hanging="720"/>
+      </w:pPr>
+      <w:r>
+        <w:t xml:space="preserve">1.</w:t>
+      </w:r>
+      <w:r>
+        <w:t xml:space="preserve"> </w:t>
+      </w:r>
+      <w:r>
+        <w:t xml:space="preserve">Assumption</w:t>
+      </w:r>
+      <w:r>
+        <w:t xml:space="preserve"> </w:t>
+      </w:r>
+      <w:r>
+        <w:t xml:space="preserve">of</w:t>
+      </w:r>
+      <w:r>
+        <w:t xml:space="preserve"> </w:t>
+      </w:r>
+      <w:r>
         <w:t xml:space="preserve">the</w:t>
       </w:r>
       <w:r>
         <w:t xml:space="preserve"> </w:t>
       </w:r>
       <w:r>
-        <w:t xml:space="preserve">Case</w:t>
+        <w:t xml:space="preserve">Risk</w:t>
+      </w:r>
+      <w:r>
+        <w:t xml:space="preserve"> </w:t>
+      </w:r>
+      <w:r>
+        <w:t xml:space="preserve">and</w:t>
+      </w:r>
+      <w:r>
+        <w:t xml:space="preserve"> </w:t>
+      </w:r>
+      <w:r>
+        <w:t xml:space="preserve">the</w:t>
+      </w:r>
+      <w:r>
+        <w:t xml:space="preserve"> </w:t>
+      </w:r>
+      <w:r>
+        <w:t xml:space="preserve">Emergency</w:t>
+      </w:r>
+      <w:r>
+        <w:t xml:space="preserve"> </w:t>
+      </w:r>
+      <w:r>
+        <w:t xml:space="preserve">Doctrine</w:t>
       </w:r>
       <w:r>
         <w:t xml:space="preserve">   </w:t>
@@ -1010,7 +1225,7 @@
         <w:tab/>
       </w:r>
       <w:r>
-        <w:t xml:space="preserve">4</w:t>
+        <w:t xml:space="preserve">11</w:t>
       </w:r>
     </w:p>
     <w:p>
@@ -1023,31 +1238,7 @@
         <w:ind w:left="720" w:right="720" w:hanging="720"/>
       </w:pPr>
       <w:r>
-        <w:t xml:space="preserve">Argument</w:t>
-      </w:r>
-      <w:r>
-        <w:t xml:space="preserve"> </w:t>
-      </w:r>
-      <w:r>
-        <w:t xml:space="preserve">and</w:t>
-      </w:r>
-      <w:r>
-        <w:t xml:space="preserve"> </w:t>
-      </w:r>
-      <w:r>
-        <w:t xml:space="preserve">Citation</w:t>
-      </w:r>
-      <w:r>
-        <w:t xml:space="preserve"> </w:t>
-      </w:r>
-      <w:r>
-        <w:t xml:space="preserve">of</w:t>
-      </w:r>
-      <w:r>
-        <w:t xml:space="preserve"> </w:t>
-      </w:r>
-      <w:r>
-        <w:t xml:space="preserve">Authority</w:t>
+        <w:t xml:space="preserve">Conclusion</w:t>
       </w:r>
       <w:r>
         <w:t xml:space="preserve">   </w:t>
@@ -1056,193 +1247,7 @@
         <w:tab/>
       </w:r>
       <w:r>
-        <w:t xml:space="preserve">8</w:t>
-      </w:r>
-    </w:p>
-    <w:p>
-      <w:pPr>
-        <w:keepLines/>
-        <w:tabs>
-          <w:tab w:val="right" w:leader="dot" w:pos="9360"/>
-        </w:tabs>
-        <w:spacing w:before="160" w:after="0" w:line="322" w:lineRule="exact"/>
-        <w:ind w:left="1440" w:right="720" w:hanging="720"/>
-      </w:pPr>
-      <w:r>
-        <w:t xml:space="preserve">A.</w:t>
-      </w:r>
-      <w:r>
-        <w:t xml:space="preserve"> </w:t>
-      </w:r>
-      <w:r>
-        <w:t xml:space="preserve">The</w:t>
-      </w:r>
-      <w:r>
-        <w:t xml:space="preserve"> </w:t>
-      </w:r>
-      <w:r>
-        <w:t xml:space="preserve">Standard</w:t>
-      </w:r>
-      <w:r>
-        <w:t xml:space="preserve"> </w:t>
-      </w:r>
-      <w:r>
-        <w:t xml:space="preserve">of</w:t>
-      </w:r>
-      <w:r>
-        <w:t xml:space="preserve"> </w:t>
-      </w:r>
-      <w:r>
-        <w:t xml:space="preserve">Review</w:t>
-      </w:r>
-      <w:r>
-        <w:t xml:space="preserve">   </w:t>
-      </w:r>
-      <w:r>
-        <w:tab/>
-      </w:r>
-      <w:r>
-        <w:t xml:space="preserve">8</w:t>
-      </w:r>
-    </w:p>
-    <w:p>
-      <w:pPr>
-        <w:keepLines/>
-        <w:tabs>
-          <w:tab w:val="right" w:leader="dot" w:pos="9360"/>
-        </w:tabs>
-        <w:spacing w:before="160" w:after="0" w:line="322" w:lineRule="exact"/>
-        <w:ind w:left="1440" w:right="720" w:hanging="720"/>
-      </w:pPr>
-      <w:r>
-        <w:t xml:space="preserve">B.</w:t>
-      </w:r>
-      <w:r>
-        <w:t xml:space="preserve"> </w:t>
-      </w:r>
-      <w:r>
-        <w:t xml:space="preserve">The</w:t>
-      </w:r>
-      <w:r>
-        <w:t xml:space="preserve"> </w:t>
-      </w:r>
-      <w:r>
-        <w:t xml:space="preserve">Trial</w:t>
-      </w:r>
-      <w:r>
-        <w:t xml:space="preserve"> </w:t>
-      </w:r>
-      <w:r>
-        <w:t xml:space="preserve">Court</w:t>
-      </w:r>
-      <w:r>
-        <w:t xml:space="preserve"> </w:t>
-      </w:r>
-      <w:r>
-        <w:t xml:space="preserve">Erred</w:t>
-      </w:r>
-      <w:r>
-        <w:t xml:space="preserve"> </w:t>
-      </w:r>
-      <w:r>
-        <w:t xml:space="preserve">in</w:t>
-      </w:r>
-      <w:r>
-        <w:t xml:space="preserve"> </w:t>
-      </w:r>
-      <w:r>
-        <w:t xml:space="preserve">Granting</w:t>
-      </w:r>
-      <w:r>
-        <w:t xml:space="preserve"> </w:t>
-      </w:r>
-      <w:r>
-        <w:t xml:space="preserve">Summary</w:t>
-      </w:r>
-      <w:r>
-        <w:t xml:space="preserve"> </w:t>
-      </w:r>
-      <w:r>
-        <w:t xml:space="preserve">Judgment</w:t>
-      </w:r>
-      <w:r>
-        <w:t xml:space="preserve">   </w:t>
-      </w:r>
-      <w:r>
-        <w:tab/>
-      </w:r>
-      <w:r>
-        <w:t xml:space="preserve">9</w:t>
-      </w:r>
-    </w:p>
-    <w:p>
-      <w:pPr>
-        <w:keepLines/>
-        <w:tabs>
-          <w:tab w:val="right" w:leader="dot" w:pos="9360"/>
-        </w:tabs>
-        <w:spacing w:before="160" w:after="0" w:line="322" w:lineRule="exact"/>
-        <w:ind w:left="2160" w:right="720" w:hanging="720"/>
-      </w:pPr>
-      <w:r>
-        <w:t xml:space="preserve">1.</w:t>
-      </w:r>
-      <w:r>
-        <w:t xml:space="preserve"> </w:t>
-      </w:r>
-      <w:r>
-        <w:t xml:space="preserve">Assumption</w:t>
-      </w:r>
-      <w:r>
-        <w:t xml:space="preserve"> </w:t>
-      </w:r>
-      <w:r>
-        <w:t xml:space="preserve">of</w:t>
-      </w:r>
-      <w:r>
-        <w:t xml:space="preserve"> </w:t>
-      </w:r>
-      <w:r>
-        <w:t xml:space="preserve">the</w:t>
-      </w:r>
-      <w:r>
-        <w:t xml:space="preserve"> </w:t>
-      </w:r>
-      <w:r>
-        <w:t xml:space="preserve">Risk</w:t>
-      </w:r>
-      <w:r>
-        <w:t xml:space="preserve"> </w:t>
-      </w:r>
-      <w:r>
-        <w:t xml:space="preserve">and</w:t>
-      </w:r>
-      <w:r>
-        <w:t xml:space="preserve"> </w:t>
-      </w:r>
-      <w:r>
-        <w:t xml:space="preserve">the</w:t>
-      </w:r>
-      <w:r>
-        <w:t xml:space="preserve"> </w:t>
-      </w:r>
-      <w:r>
-        <w:t xml:space="preserve">Emergency</w:t>
-      </w:r>
-      <w:r>
-        <w:t xml:space="preserve"> </w:t>
-      </w:r>
-      <w:r>
-        <w:t xml:space="preserve">Doctrine</w:t>
-      </w:r>
-      <w:r>
-        <w:t xml:space="preserve">   </w:t>
-      </w:r>
-      <w:r>
-        <w:tab/>
-      </w:r>
-      <w:r>
-        <w:t xml:space="preserve">11</w:t>
+        <w:t xml:space="preserve">15</w:t>
       </w:r>
     </w:p>
     <w:p>
@@ -1255,7 +1260,19 @@
         <w:ind w:left="720" w:right="720" w:hanging="720"/>
       </w:pPr>
       <w:r>
-        <w:t xml:space="preserve">Conclusion</w:t>
+        <w:t xml:space="preserve">Certificate</w:t>
+      </w:r>
+      <w:r>
+        <w:t xml:space="preserve"> </w:t>
+      </w:r>
+      <w:r>
+        <w:t xml:space="preserve">of</w:t>
+      </w:r>
+      <w:r>
+        <w:t xml:space="preserve"> </w:t>
+      </w:r>
+      <w:r>
+        <w:t xml:space="preserve">Service</w:t>
       </w:r>
       <w:r>
         <w:t xml:space="preserve">   </w:t>
@@ -1264,48 +1281,19 @@
         <w:tab/>
       </w:r>
       <w:r>
-        <w:t xml:space="preserve">15</w:t>
-      </w:r>
-    </w:p>
-    <w:p>
-      <w:pPr>
-        <w:keepLines/>
-        <w:tabs>
-          <w:tab w:val="right" w:leader="dot" w:pos="9360"/>
-        </w:tabs>
-        <w:spacing w:before="160" w:after="0" w:line="322" w:lineRule="exact"/>
-        <w:ind w:left="720" w:right="720" w:hanging="720"/>
-      </w:pPr>
-      <w:r>
-        <w:t xml:space="preserve">Certificate</w:t>
-      </w:r>
-      <w:r>
-        <w:t xml:space="preserve"> </w:t>
-      </w:r>
-      <w:r>
-        <w:t xml:space="preserve">of</w:t>
-      </w:r>
-      <w:r>
-        <w:t xml:space="preserve"> </w:t>
-      </w:r>
-      <w:r>
-        <w:t xml:space="preserve">Service</w:t>
-      </w:r>
-      <w:r>
-        <w:t xml:space="preserve">   </w:t>
-      </w:r>
-      <w:r>
-        <w:tab/>
-      </w:r>
-      <w:r>
         <w:t xml:space="preserve">17</w:t>
       </w:r>
+    </w:p>
+    <w:p>
+      <w:pPr>
+        <w:pageBreakBefore/>
+        <w:spacing w:before="0" w:after="0" w:line="1" w:lineRule="exact"/>
+      </w:pPr>
     </w:p>
     <w:p>
       <w:pPr>
         <w:keepNext/>
         <w:keepLines/>
-        <w:pageBreakBefore/>
         <w:spacing w:before="0" w:after="320" w:line="322" w:lineRule="exact"/>
         <w:ind w:left="0" w:firstLine="0"/>
         <w:jc w:val="center"/>
@@ -1352,6 +1340,7 @@
         <w:keepLines/>
         <w:spacing w:before="322" w:after="0" w:line="322" w:lineRule="exact"/>
         <w:ind w:left="0" w:firstLine="0"/>
+        <w:jc w:val="left"/>
       </w:pPr>
       <w:r>
         <w:rPr>
@@ -2550,6 +2539,7 @@
         <w:keepLines/>
         <w:spacing w:before="322" w:after="0" w:line="322" w:lineRule="exact"/>
         <w:ind w:left="0" w:firstLine="0"/>
+        <w:jc w:val="left"/>
       </w:pPr>
       <w:r>
         <w:rPr>
@@ -2631,9 +2621,14 @@
     </w:p>
     <w:p>
       <w:pPr>
+        <w:pageBreakBefore/>
+        <w:spacing w:before="0" w:after="0" w:line="1" w:lineRule="exact"/>
+      </w:pPr>
+    </w:p>
+    <w:p>
+      <w:pPr>
         <w:keepNext/>
         <w:keepLines/>
-        <w:pageBreakBefore/>
         <w:spacing w:before="0" w:after="320" w:line="322" w:lineRule="exact"/>
         <w:ind w:left="0" w:firstLine="0"/>
         <w:jc w:val="center"/>
@@ -2732,7 +2727,7 @@
     </w:p>
     <w:p>
       <w:pPr>
-        <w:pStyle w:val="FirstParagraph"/>
+        <w:pStyle w:val="BodyText"/>
       </w:pPr>
       <w:r>
         <w:t xml:space="preserve">The underlying case arises from a premises incident that occurred in Valdosta, Georgia. The issue here is whether the Trial Court erred when it granted Appellee’s Motion for Summary Judgment. There are genuine issues as to whether the Appellant assumed the risk, and whether the Appellant exercised ordinary care for her own safety in the face of a bona fide emergency.</w:t>
@@ -2773,7 +2768,13 @@
         <w:pStyle w:val="BodyText"/>
       </w:pPr>
       <w:r>
-        <w:t xml:space="preserve">Jurisdiction is properly in the Court of Appeals of Georgia as this is not a case in which the Supreme Court has exclusive jurisdiction under the Constitution of the State of Georgia. Ga. Const. Art. VI, § VI, ¶¶ 2, 3.</w:t>
+        <w:t xml:space="preserve">Jurisdiction is properly in the Court of Appeals of Georgia as this is not a case in which the Supreme Court has exclusive jurisdiction under the Constitution of the State of Georgia. Ga. Const. Art. VI,</w:t>
+      </w:r>
+      <w:r>
+        <w:t xml:space="preserve"> </w:t>
+      </w:r>
+      <w:r>
+        <w:t xml:space="preserve">§ VI, ¶¶ 2, 3.</w:t>
       </w:r>
     </w:p>
     <w:p>
@@ -2954,7 +2955,7 @@
     </w:p>
     <w:p>
       <w:pPr>
-        <w:pStyle w:val="BlockText"/>
+        <w:pStyle w:val="XdQuoteFirst"/>
       </w:pPr>
       <w:r>
         <w:t xml:space="preserve">Q: I guess when you got to the scene of the accident, why did you wait to call the police?</w:t>
@@ -2962,7 +2963,7 @@
     </w:p>
     <w:p>
       <w:pPr>
-        <w:pStyle w:val="BlockText"/>
+        <w:pStyle w:val="XdQuoteLast"/>
       </w:pPr>
       <w:r>
         <w:t xml:space="preserve">A: My mom was in danger. She had already been tackled and choked and hit and she’s blind. She could not see to defend herself. And, you know, that’s my mom so my first instinct was to try and get her out of danger, not to defend her, but to get her out of the situation.</w:t>
@@ -2970,7 +2971,7 @@
     </w:p>
     <w:p>
       <w:pPr>
-        <w:pStyle w:val="FirstParagraph"/>
+        <w:pStyle w:val="BodyText"/>
       </w:pPr>
       <w:r>
         <w:t xml:space="preserve">(R: 103, lines 7</w:t>
@@ -3174,6 +3175,7 @@
         <w:keepLines/>
         <w:spacing w:before="320" w:after="240" w:line="322" w:lineRule="exact"/>
         <w:ind w:left="720" w:hanging="720"/>
+        <w:jc w:val="left"/>
       </w:pPr>
       <w:r>
         <w:rPr>
@@ -3257,7 +3259,13 @@
         <w:t xml:space="preserve">Houston v. Wal-Mart Stores E., L.P.</w:t>
       </w:r>
       <w:r>
-        <w:t xml:space="preserve">, 324 Ga. App. 105, 105</w:t>
+        <w:t xml:space="preserve">, 324 Ga. App.</w:t>
+      </w:r>
+      <w:r>
+        <w:t xml:space="preserve"> </w:t>
+      </w:r>
+      <w:r>
+        <w:t xml:space="preserve">105, 105</w:t>
       </w:r>
       <w:r>
         <w:noBreakHyphen/>
@@ -3284,7 +3292,13 @@
         <w:t xml:space="preserve">Norton v. Ga. R. Bank &amp; Trust</w:t>
       </w:r>
       <w:r>
-        <w:t xml:space="preserve">, 253 Ga. 596, 603 (1984). Importantly, “questions of negligence, diligence, contributory negligence and proximate cause are peculiarly matters for the Jury, and a Court should not take the place of the Jury in solving them, except in plain and undisputed cases.”</w:t>
+        <w:t xml:space="preserve">, 253 Ga. 596,</w:t>
+      </w:r>
+      <w:r>
+        <w:t xml:space="preserve"> </w:t>
+      </w:r>
+      <w:r>
+        <w:t xml:space="preserve">603 (1984). Importantly, “questions of negligence, diligence, contributory negligence and proximate cause are peculiarly matters for the Jury, and a Court should not take the place of the Jury in solving them, except in plain and undisputed cases.”</w:t>
       </w:r>
       <w:r>
         <w:t xml:space="preserve"> </w:t>
@@ -3297,7 +3311,13 @@
         <w:t xml:space="preserve">Reed v. Carolina Cas. Ins. Co.</w:t>
       </w:r>
       <w:r>
-        <w:t xml:space="preserve">, 327 Ga. App. 130 (2014).</w:t>
+        <w:t xml:space="preserve">, 327 Ga. App.</w:t>
+      </w:r>
+      <w:r>
+        <w:t xml:space="preserve"> </w:t>
+      </w:r>
+      <w:r>
+        <w:t xml:space="preserve">130 (2014).</w:t>
       </w:r>
       <w:r>
         <w:t xml:space="preserve"> </w:t>
@@ -3323,7 +3343,13 @@
         <w:t xml:space="preserve">Sutton v. Justiss</w:t>
       </w:r>
       <w:r>
-        <w:t xml:space="preserve">, 290 Ga. App. 565, 566 (2008) (“[i]f reasonable minds can differ on the cause of the injury, the case is not plain, palpable, and indisputable and it should go to the Jury”).</w:t>
+        <w:t xml:space="preserve">, 290 Ga. App.</w:t>
+      </w:r>
+      <w:r>
+        <w:t xml:space="preserve"> </w:t>
+      </w:r>
+      <w:r>
+        <w:t xml:space="preserve">565, 566 (2008) (“[i]f reasonable minds can differ on the cause of the injury, the case is not plain, palpable, and indisputable and it should go to the Jury”).</w:t>
       </w:r>
     </w:p>
     <w:p>
@@ -3332,6 +3358,7 @@
         <w:keepLines/>
         <w:spacing w:before="320" w:after="240" w:line="322" w:lineRule="exact"/>
         <w:ind w:left="720" w:hanging="720"/>
+        <w:jc w:val="left"/>
       </w:pPr>
       <w:r>
         <w:rPr>
@@ -3485,7 +3512,13 @@
         <w:t xml:space="preserve">Scott v. Owens-Illinois, Inc.</w:t>
       </w:r>
       <w:r>
-        <w:t xml:space="preserve">, 173 Ga. App. 19, 21 (1984). Moreover, the Appellate Courts caution that just because a particular evidentiary posture may suffice to authorize the grant of a directed verdict, the very same evidence may not suffice to authorize the grant of summary judgment, especially in a case where, “the party making the motion for summary judgment is not required to carry the burden on the Trial of the case.”</w:t>
+        <w:t xml:space="preserve">, 173 Ga. App.</w:t>
+      </w:r>
+      <w:r>
+        <w:t xml:space="preserve"> </w:t>
+      </w:r>
+      <w:r>
+        <w:t xml:space="preserve">19, 21 (1984). Moreover, the Appellate Courts caution that just because a particular evidentiary posture may suffice to authorize the grant of a directed verdict, the very same evidence may not suffice to authorize the grant of summary judgment, especially in a case where, “the party making the motion for summary judgment is not required to carry the burden on the Trial of the case.”</w:t>
       </w:r>
       <w:r>
         <w:t xml:space="preserve"> </w:t>
@@ -3498,7 +3531,13 @@
         <w:t xml:space="preserve">Winn-Dixie of Greenville v. Ramey</w:t>
       </w:r>
       <w:r>
-        <w:t xml:space="preserve">, 186 Ga. App. 257, 258 (1988).</w:t>
+        <w:t xml:space="preserve">, 186 Ga. App.</w:t>
+      </w:r>
+      <w:r>
+        <w:t xml:space="preserve"> </w:t>
+      </w:r>
+      <w:r>
+        <w:t xml:space="preserve">257, 258 (1988).</w:t>
       </w:r>
     </w:p>
     <w:p>
@@ -3519,7 +3558,13 @@
         <w:t xml:space="preserve">Albright v. Terminal Investment Corp.</w:t>
       </w:r>
       <w:r>
-        <w:t xml:space="preserve">, 373 Ga. App. 798 at 804</w:t>
+        <w:t xml:space="preserve">, 373 Ga. App.</w:t>
+      </w:r>
+      <w:r>
+        <w:t xml:space="preserve"> </w:t>
+      </w:r>
+      <w:r>
+        <w:t xml:space="preserve">798 at 804</w:t>
       </w:r>
       <w:r>
         <w:noBreakHyphen/>
@@ -3546,7 +3591,13 @@
         <w:t xml:space="preserve">Kane v. Landscape Structures, Inc.</w:t>
       </w:r>
       <w:r>
-        <w:t xml:space="preserve">, 309 Ga. App. 14, 16</w:t>
+        <w:t xml:space="preserve">, 309 Ga. App.</w:t>
+      </w:r>
+      <w:r>
+        <w:t xml:space="preserve"> </w:t>
+      </w:r>
+      <w:r>
+        <w:t xml:space="preserve">14, 16</w:t>
       </w:r>
       <w:r>
         <w:noBreakHyphen/>
@@ -3561,6 +3612,7 @@
         <w:keepLines/>
         <w:spacing w:before="320" w:after="240" w:line="322" w:lineRule="exact"/>
         <w:ind w:left="720" w:hanging="720"/>
+        <w:jc w:val="left"/>
       </w:pPr>
       <w:r>
         <w:rPr>
@@ -3747,7 +3799,13 @@
         <w:t xml:space="preserve">Kane</w:t>
       </w:r>
       <w:r>
-        <w:t xml:space="preserve">, 309 Ga. App. at 17. “The specific danger of which a plaintiff must be actually aware for purposes of assumption of the risk is ‘the specific, particular risk of harm associated with the activity or condition that proximately causes injury . . . .’”</w:t>
+        <w:t xml:space="preserve">, 309 Ga. App.</w:t>
+      </w:r>
+      <w:r>
+        <w:t xml:space="preserve"> </w:t>
+      </w:r>
+      <w:r>
+        <w:t xml:space="preserve">at 17. “The specific danger of which a plaintiff must be actually aware for purposes of assumption of the risk is ‘the specific, particular risk of harm associated with the activity or condition that proximately causes injury . . . .’”</w:t>
       </w:r>
       <w:r>
         <w:t xml:space="preserve"> </w:t>
@@ -3776,7 +3834,13 @@
         <w:t xml:space="preserve">Osburn v. Pilgrim</w:t>
       </w:r>
       <w:r>
-        <w:t xml:space="preserve">, 246 Ga. 688, 695 (1980).</w:t>
+        <w:t xml:space="preserve">, 246 Ga. 688,</w:t>
+      </w:r>
+      <w:r>
+        <w:t xml:space="preserve"> </w:t>
+      </w:r>
+      <w:r>
+        <w:t xml:space="preserve">695 (1980).</w:t>
       </w:r>
     </w:p>
     <w:p>
@@ -3825,7 +3889,13 @@
         <w:t xml:space="preserve">Kane v. Landscape Structures, Inc.</w:t>
       </w:r>
       <w:r>
-        <w:t xml:space="preserve">, 309 Ga. App. 14 (2011), to set forth the standard for assumption of the risk without appreciating that the underlying facts of the</w:t>
+        <w:t xml:space="preserve">, 309 Ga. App.</w:t>
+      </w:r>
+      <w:r>
+        <w:t xml:space="preserve"> </w:t>
+      </w:r>
+      <w:r>
+        <w:t xml:space="preserve">14 (2011), to set forth the standard for assumption of the risk without appreciating that the underlying facts of the</w:t>
       </w:r>
       <w:r>
         <w:t xml:space="preserve"> </w:t>
@@ -3894,7 +3964,13 @@
         <w:t xml:space="preserve">Kane</w:t>
       </w:r>
       <w:r>
-        <w:t xml:space="preserve">, 309 Ga. App. at 15</w:t>
+        <w:t xml:space="preserve">, 309 Ga. App.</w:t>
+      </w:r>
+      <w:r>
+        <w:t xml:space="preserve"> </w:t>
+      </w:r>
+      <w:r>
+        <w:t xml:space="preserve">at 15</w:t>
       </w:r>
       <w:r>
         <w:noBreakHyphen/>
@@ -3969,7 +4045,13 @@
         <w:t xml:space="preserve">Carter v. Scott</w:t>
       </w:r>
       <w:r>
-        <w:t xml:space="preserve">, 320 Ga. App. 404 (2013), in its evaluation of the assumption of the risk defense raised by Appellees. In</w:t>
+        <w:t xml:space="preserve">, 320 Ga. App.</w:t>
+      </w:r>
+      <w:r>
+        <w:t xml:space="preserve"> </w:t>
+      </w:r>
+      <w:r>
+        <w:t xml:space="preserve">404 (2013), in its evaluation of the assumption of the risk defense raised by Appellees. In</w:t>
       </w:r>
       <w:r>
         <w:t xml:space="preserve"> </w:t>
@@ -4063,7 +4145,13 @@
         <w:t xml:space="preserve">Ware v. Alston</w:t>
       </w:r>
       <w:r>
-        <w:t xml:space="preserve">, 112 Ga. App. 627, 629 (1965). The</w:t>
+        <w:t xml:space="preserve">, 112 Ga. App.</w:t>
+      </w:r>
+      <w:r>
+        <w:t xml:space="preserve"> </w:t>
+      </w:r>
+      <w:r>
+        <w:t xml:space="preserve">627, 629 (1965). The</w:t>
       </w:r>
       <w:r>
         <w:t xml:space="preserve"> </w:t>
@@ -4132,7 +4220,13 @@
         <w:t xml:space="preserve">Reed</w:t>
       </w:r>
       <w:r>
-        <w:t xml:space="preserve">, 327 Ga. App. 130 (2014). Moreover, the existence of even slight evidence that gives rise to a triable issue of material fact will suffice to defeat summary judgment.</w:t>
+        <w:t xml:space="preserve">, 327 Ga. App.</w:t>
+      </w:r>
+      <w:r>
+        <w:t xml:space="preserve"> </w:t>
+      </w:r>
+      <w:r>
+        <w:t xml:space="preserve">130 (2014). Moreover, the existence of even slight evidence that gives rise to a triable issue of material fact will suffice to defeat summary judgment.</w:t>
       </w:r>
       <w:r>
         <w:t xml:space="preserve"> </w:t>
@@ -4145,715 +4239,730 @@
         <w:t xml:space="preserve">Albright</w:t>
       </w:r>
       <w:r>
-        <w:t xml:space="preserve">, 373 Ga. App. 798 at 805 (2024). Therefore, Appellant respectfully requests that this Honorable Court reverse the Trial Court’s ruling on summary judgment and remit for further proceedings in that Court.</w:t>
-      </w:r>
+        <w:t xml:space="preserve">, 373 Ga. App.</w:t>
+      </w:r>
+      <w:r>
+        <w:t xml:space="preserve"> </w:t>
+      </w:r>
+      <w:r>
+        <w:t xml:space="preserve">798 at 805 (2024). Therefore, Appellant respectfully requests that this Honorable Court reverse the Trial Court’s ruling on summary judgment and remit for further proceedings in that Court.</w:t>
+      </w:r>
+    </w:p>
+    <w:tbl>
+      <w:tblPr>
+        <w:tblW w:w="9360" w:type="dxa"/>
+        <w:tblLayout w:type="fixed"/>
+        <w:tblCellMar>
+          <w:top w:w="0" w:type="dxa"/>
+          <w:left w:w="0" w:type="dxa"/>
+          <w:bottom w:w="0" w:type="dxa"/>
+          <w:right w:w="0" w:type="dxa"/>
+        </w:tblCellMar>
+        <w:tblLook w:val="0000" w:firstRow="0" w:lastRow="0" w:firstColumn="0" w:lastColumn="0" w:noHBand="0" w:noVBand="0"/>
+      </w:tblPr>
+      <w:tblGrid>
+        <w:gridCol w:w="9360"/>
+      </w:tblGrid>
+      <w:tr>
+        <w:trPr>
+          <w:cantSplit/>
+        </w:trPr>
+        <w:tc>
+          <w:tcPr>
+            <w:tcW w:w="9360" w:type="dxa"/>
+          </w:tcPr>
+          <w:p>
+            <w:pPr>
+              <w:spacing w:before="0" w:after="0" w:line="644" w:lineRule="exact"/>
+              <w:ind w:left="0" w:firstLine="720"/>
+              <w:jc w:val="left"/>
+            </w:pPr>
+            <w:r>
+              <w:t xml:space="preserve">This</w:t>
+            </w:r>
+            <w:r>
+              <w:t xml:space="preserve"> </w:t>
+            </w:r>
+            <w:r>
+              <w:t xml:space="preserve">submission</w:t>
+            </w:r>
+            <w:r>
+              <w:t xml:space="preserve"> </w:t>
+            </w:r>
+            <w:r>
+              <w:t xml:space="preserve">does</w:t>
+            </w:r>
+            <w:r>
+              <w:t xml:space="preserve"> </w:t>
+            </w:r>
+            <w:r>
+              <w:t xml:space="preserve">not</w:t>
+            </w:r>
+            <w:r>
+              <w:t xml:space="preserve"> </w:t>
+            </w:r>
+            <w:r>
+              <w:t xml:space="preserve">exceed</w:t>
+            </w:r>
+            <w:r>
+              <w:t xml:space="preserve"> </w:t>
+            </w:r>
+            <w:r>
+              <w:t xml:space="preserve">the</w:t>
+            </w:r>
+            <w:r>
+              <w:t xml:space="preserve"> </w:t>
+            </w:r>
+            <w:r>
+              <w:t xml:space="preserve">word</w:t>
+            </w:r>
+            <w:r>
+              <w:t xml:space="preserve"> </w:t>
+            </w:r>
+            <w:r>
+              <w:t xml:space="preserve">count</w:t>
+            </w:r>
+            <w:r>
+              <w:t xml:space="preserve"> </w:t>
+            </w:r>
+            <w:r>
+              <w:t xml:space="preserve">limit</w:t>
+            </w:r>
+            <w:r>
+              <w:t xml:space="preserve"> </w:t>
+            </w:r>
+            <w:r>
+              <w:t xml:space="preserve">imposed</w:t>
+            </w:r>
+            <w:r>
+              <w:t xml:space="preserve"> </w:t>
+            </w:r>
+            <w:r>
+              <w:t xml:space="preserve">by</w:t>
+            </w:r>
+            <w:r>
+              <w:t xml:space="preserve"> </w:t>
+            </w:r>
+            <w:r>
+              <w:t xml:space="preserve">Rule</w:t>
+            </w:r>
+            <w:r>
+              <w:t xml:space="preserve"> </w:t>
+            </w:r>
+            <w:r>
+              <w:t xml:space="preserve">24.</w:t>
+            </w:r>
+          </w:p>
+          <w:p>
+            <w:pPr>
+              <w:spacing w:before="0" w:after="0" w:line="644" w:lineRule="exact"/>
+              <w:ind w:left="0" w:firstLine="720"/>
+              <w:jc w:val="left"/>
+            </w:pPr>
+            <w:r>
+              <w:t xml:space="preserve">Respectfully</w:t>
+            </w:r>
+            <w:r>
+              <w:t xml:space="preserve"> </w:t>
+            </w:r>
+            <w:r>
+              <w:t xml:space="preserve">submitted</w:t>
+            </w:r>
+            <w:r>
+              <w:t xml:space="preserve"> </w:t>
+            </w:r>
+            <w:r>
+              <w:t xml:space="preserve">this</w:t>
+            </w:r>
+            <w:r>
+              <w:t xml:space="preserve"> </w:t>
+            </w:r>
+            <w:r>
+              <w:t xml:space="preserve">26th</w:t>
+            </w:r>
+            <w:r>
+              <w:t xml:space="preserve"> </w:t>
+            </w:r>
+            <w:r>
+              <w:t xml:space="preserve">day</w:t>
+            </w:r>
+            <w:r>
+              <w:t xml:space="preserve"> </w:t>
+            </w:r>
+            <w:r>
+              <w:t xml:space="preserve">of</w:t>
+            </w:r>
+            <w:r>
+              <w:t xml:space="preserve"> </w:t>
+            </w:r>
+            <w:r>
+              <w:t xml:space="preserve">January</w:t>
+            </w:r>
+            <w:r>
+              <w:t xml:space="preserve"> </w:t>
+            </w:r>
+            <w:r>
+              <w:t xml:space="preserve">2026.</w:t>
+            </w:r>
+          </w:p>
+          <w:p>
+            <w:pPr>
+              <w:spacing w:before="160" w:after="0" w:line="322" w:lineRule="exact"/>
+              <w:ind w:left="4608" w:firstLine="0"/>
+              <w:jc w:val="left"/>
+            </w:pPr>
+            <w:r>
+              <w:rPr>
+                <w:b/>
+                <w:bCs/>
+              </w:rPr>
+              <w:t xml:space="preserve">JODY</w:t>
+            </w:r>
+            <w:r>
+              <w:rPr>
+                <w:b/>
+                <w:bCs/>
+              </w:rPr>
+              <w:t xml:space="preserve"> </w:t>
+            </w:r>
+            <w:r>
+              <w:rPr>
+                <w:b/>
+                <w:bCs/>
+              </w:rPr>
+              <w:t xml:space="preserve">D.</w:t>
+            </w:r>
+            <w:r>
+              <w:rPr>
+                <w:b/>
+                <w:bCs/>
+              </w:rPr>
+              <w:t xml:space="preserve"> </w:t>
+            </w:r>
+            <w:r>
+              <w:rPr>
+                <w:b/>
+                <w:bCs/>
+              </w:rPr>
+              <w:t xml:space="preserve">PETERMAN,</w:t>
+            </w:r>
+            <w:r>
+              <w:rPr>
+                <w:b/>
+                <w:bCs/>
+              </w:rPr>
+              <w:t xml:space="preserve"> </w:t>
+            </w:r>
+            <w:r>
+              <w:rPr>
+                <w:b/>
+                <w:bCs/>
+              </w:rPr>
+              <w:t xml:space="preserve">LLC</w:t>
+            </w:r>
+          </w:p>
+          <w:p>
+            <w:pPr>
+              <w:spacing w:before="240" w:after="0" w:line="322" w:lineRule="exact"/>
+              <w:ind w:left="4608" w:firstLine="0"/>
+              <w:jc w:val="left"/>
+            </w:pPr>
+            <w:r>
+              <w:rPr>
+                <w:u w:val="single"/>
+              </w:rPr>
+              <w:t xml:space="preserve">/s/</w:t>
+            </w:r>
+            <w:r>
+              <w:rPr>
+                <w:u w:val="single"/>
+              </w:rPr>
+              <w:t xml:space="preserve"> </w:t>
+            </w:r>
+            <w:r>
+              <w:rPr>
+                <w:i/>
+                <w:iCs/>
+                <w:u w:val="single"/>
+              </w:rPr>
+              <w:t xml:space="preserve">Jody</w:t>
+            </w:r>
+            <w:r>
+              <w:rPr>
+                <w:i/>
+                <w:iCs/>
+                <w:u w:val="single"/>
+              </w:rPr>
+              <w:t xml:space="preserve"> </w:t>
+            </w:r>
+            <w:r>
+              <w:rPr>
+                <w:i/>
+                <w:iCs/>
+                <w:u w:val="single"/>
+              </w:rPr>
+              <w:t xml:space="preserve">D.</w:t>
+            </w:r>
+            <w:r>
+              <w:rPr>
+                <w:i/>
+                <w:iCs/>
+                <w:u w:val="single"/>
+              </w:rPr>
+              <w:t xml:space="preserve"> </w:t>
+            </w:r>
+            <w:r>
+              <w:rPr>
+                <w:i/>
+                <w:iCs/>
+                <w:u w:val="single"/>
+              </w:rPr>
+              <w:t xml:space="preserve">Peterman</w:t>
+            </w:r>
+          </w:p>
+          <w:p>
+            <w:pPr>
+              <w:spacing w:before="0" w:after="0" w:line="322" w:lineRule="exact"/>
+              <w:ind w:left="4608" w:firstLine="0"/>
+              <w:jc w:val="left"/>
+            </w:pPr>
+            <w:r>
+              <w:t xml:space="preserve">Jody</w:t>
+            </w:r>
+            <w:r>
+              <w:t xml:space="preserve"> </w:t>
+            </w:r>
+            <w:r>
+              <w:t xml:space="preserve">D.</w:t>
+            </w:r>
+            <w:r>
+              <w:t xml:space="preserve"> </w:t>
+            </w:r>
+            <w:r>
+              <w:t xml:space="preserve">Peterman</w:t>
+            </w:r>
+          </w:p>
+          <w:p>
+            <w:pPr>
+              <w:spacing w:before="0" w:after="0" w:line="322" w:lineRule="exact"/>
+              <w:ind w:left="4608" w:firstLine="0"/>
+              <w:jc w:val="left"/>
+            </w:pPr>
+            <w:r>
+              <w:t xml:space="preserve">Georgia</w:t>
+            </w:r>
+            <w:r>
+              <w:t xml:space="preserve"> </w:t>
+            </w:r>
+            <w:r>
+              <w:t xml:space="preserve">Bar</w:t>
+            </w:r>
+            <w:r>
+              <w:t xml:space="preserve"> </w:t>
+            </w:r>
+            <w:r>
+              <w:t xml:space="preserve">No.</w:t>
+            </w:r>
+            <w:r>
+              <w:t xml:space="preserve"> </w:t>
+            </w:r>
+            <w:r>
+              <w:t xml:space="preserve">573552</w:t>
+            </w:r>
+          </w:p>
+          <w:p>
+            <w:pPr>
+              <w:spacing w:before="240" w:after="0" w:line="322" w:lineRule="exact"/>
+              <w:ind w:left="4608" w:firstLine="0"/>
+              <w:jc w:val="left"/>
+            </w:pPr>
+            <w:r>
+              <w:rPr>
+                <w:u w:val="single"/>
+              </w:rPr>
+              <w:t xml:space="preserve">/s/</w:t>
+            </w:r>
+            <w:r>
+              <w:rPr>
+                <w:u w:val="single"/>
+              </w:rPr>
+              <w:t xml:space="preserve"> </w:t>
+            </w:r>
+            <w:r>
+              <w:rPr>
+                <w:i/>
+                <w:iCs/>
+                <w:u w:val="single"/>
+              </w:rPr>
+              <w:t xml:space="preserve">T.</w:t>
+            </w:r>
+            <w:r>
+              <w:rPr>
+                <w:i/>
+                <w:iCs/>
+                <w:u w:val="single"/>
+              </w:rPr>
+              <w:t xml:space="preserve"> </w:t>
+            </w:r>
+            <w:r>
+              <w:rPr>
+                <w:i/>
+                <w:iCs/>
+                <w:u w:val="single"/>
+              </w:rPr>
+              <w:t xml:space="preserve">Michael</w:t>
+            </w:r>
+            <w:r>
+              <w:rPr>
+                <w:i/>
+                <w:iCs/>
+                <w:u w:val="single"/>
+              </w:rPr>
+              <w:t xml:space="preserve"> </w:t>
+            </w:r>
+            <w:r>
+              <w:rPr>
+                <w:i/>
+                <w:iCs/>
+                <w:u w:val="single"/>
+              </w:rPr>
+              <w:t xml:space="preserve">Burke,</w:t>
+            </w:r>
+            <w:r>
+              <w:rPr>
+                <w:i/>
+                <w:iCs/>
+                <w:u w:val="single"/>
+              </w:rPr>
+              <w:t xml:space="preserve"> </w:t>
+            </w:r>
+            <w:r>
+              <w:rPr>
+                <w:i/>
+                <w:iCs/>
+                <w:u w:val="single"/>
+              </w:rPr>
+              <w:t xml:space="preserve">Jr.</w:t>
+            </w:r>
+          </w:p>
+          <w:p>
+            <w:pPr>
+              <w:spacing w:before="0" w:after="0" w:line="322" w:lineRule="exact"/>
+              <w:ind w:left="4608" w:firstLine="0"/>
+              <w:jc w:val="left"/>
+            </w:pPr>
+            <w:r>
+              <w:t xml:space="preserve">T.</w:t>
+            </w:r>
+            <w:r>
+              <w:t xml:space="preserve"> </w:t>
+            </w:r>
+            <w:r>
+              <w:t xml:space="preserve">Michael</w:t>
+            </w:r>
+            <w:r>
+              <w:t xml:space="preserve"> </w:t>
+            </w:r>
+            <w:r>
+              <w:t xml:space="preserve">Burke,</w:t>
+            </w:r>
+            <w:r>
+              <w:t xml:space="preserve"> </w:t>
+            </w:r>
+            <w:r>
+              <w:t xml:space="preserve">Jr.</w:t>
+            </w:r>
+          </w:p>
+          <w:p>
+            <w:pPr>
+              <w:spacing w:before="0" w:after="0" w:line="322" w:lineRule="exact"/>
+              <w:ind w:left="4608" w:firstLine="0"/>
+              <w:jc w:val="left"/>
+            </w:pPr>
+            <w:r>
+              <w:t xml:space="preserve">Georgia</w:t>
+            </w:r>
+            <w:r>
+              <w:t xml:space="preserve"> </w:t>
+            </w:r>
+            <w:r>
+              <w:t xml:space="preserve">Bar</w:t>
+            </w:r>
+            <w:r>
+              <w:t xml:space="preserve"> </w:t>
+            </w:r>
+            <w:r>
+              <w:t xml:space="preserve">No.</w:t>
+            </w:r>
+            <w:r>
+              <w:t xml:space="preserve"> </w:t>
+            </w:r>
+            <w:r>
+              <w:t xml:space="preserve">106106</w:t>
+            </w:r>
+          </w:p>
+          <w:p>
+            <w:pPr>
+              <w:spacing w:before="240" w:after="0" w:line="322" w:lineRule="exact"/>
+              <w:ind w:left="4608" w:firstLine="0"/>
+              <w:jc w:val="left"/>
+            </w:pPr>
+            <w:r>
+              <w:rPr>
+                <w:u w:val="single"/>
+              </w:rPr>
+              <w:t xml:space="preserve">/s/</w:t>
+            </w:r>
+            <w:r>
+              <w:rPr>
+                <w:u w:val="single"/>
+              </w:rPr>
+              <w:t xml:space="preserve"> </w:t>
+            </w:r>
+            <w:r>
+              <w:rPr>
+                <w:i/>
+                <w:iCs/>
+                <w:u w:val="single"/>
+              </w:rPr>
+              <w:t xml:space="preserve">Stephen</w:t>
+            </w:r>
+            <w:r>
+              <w:rPr>
+                <w:i/>
+                <w:iCs/>
+                <w:u w:val="single"/>
+              </w:rPr>
+              <w:t xml:space="preserve"> </w:t>
+            </w:r>
+            <w:r>
+              <w:rPr>
+                <w:i/>
+                <w:iCs/>
+                <w:u w:val="single"/>
+              </w:rPr>
+              <w:t xml:space="preserve">D.</w:t>
+            </w:r>
+            <w:r>
+              <w:rPr>
+                <w:i/>
+                <w:iCs/>
+                <w:u w:val="single"/>
+              </w:rPr>
+              <w:t xml:space="preserve"> </w:t>
+            </w:r>
+            <w:r>
+              <w:rPr>
+                <w:i/>
+                <w:iCs/>
+                <w:u w:val="single"/>
+              </w:rPr>
+              <w:t xml:space="preserve">Delk</w:t>
+            </w:r>
+          </w:p>
+          <w:p>
+            <w:pPr>
+              <w:spacing w:before="0" w:after="0" w:line="322" w:lineRule="exact"/>
+              <w:ind w:left="4608" w:firstLine="0"/>
+              <w:jc w:val="left"/>
+            </w:pPr>
+            <w:r>
+              <w:t xml:space="preserve">Stephen</w:t>
+            </w:r>
+            <w:r>
+              <w:t xml:space="preserve"> </w:t>
+            </w:r>
+            <w:r>
+              <w:t xml:space="preserve">D.</w:t>
+            </w:r>
+            <w:r>
+              <w:t xml:space="preserve"> </w:t>
+            </w:r>
+            <w:r>
+              <w:t xml:space="preserve">Delk</w:t>
+            </w:r>
+          </w:p>
+          <w:p>
+            <w:pPr>
+              <w:spacing w:before="0" w:after="0" w:line="322" w:lineRule="exact"/>
+              <w:ind w:left="4608" w:firstLine="0"/>
+              <w:jc w:val="left"/>
+            </w:pPr>
+            <w:r>
+              <w:t xml:space="preserve">Georgia</w:t>
+            </w:r>
+            <w:r>
+              <w:t xml:space="preserve"> </w:t>
+            </w:r>
+            <w:r>
+              <w:t xml:space="preserve">Bar</w:t>
+            </w:r>
+            <w:r>
+              <w:t xml:space="preserve"> </w:t>
+            </w:r>
+            <w:r>
+              <w:t xml:space="preserve">No.</w:t>
+            </w:r>
+            <w:r>
+              <w:t xml:space="preserve"> </w:t>
+            </w:r>
+            <w:r>
+              <w:t xml:space="preserve">448395</w:t>
+            </w:r>
+          </w:p>
+          <w:p>
+            <w:pPr>
+              <w:spacing w:before="160" w:after="0" w:line="322" w:lineRule="exact"/>
+              <w:ind w:left="4608" w:firstLine="0"/>
+              <w:jc w:val="left"/>
+            </w:pPr>
+            <w:r>
+              <w:rPr>
+                <w:i/>
+                <w:iCs/>
+              </w:rPr>
+              <w:t xml:space="preserve">Attorneys</w:t>
+            </w:r>
+            <w:r>
+              <w:rPr>
+                <w:i/>
+                <w:iCs/>
+              </w:rPr>
+              <w:t xml:space="preserve"> </w:t>
+            </w:r>
+            <w:r>
+              <w:rPr>
+                <w:i/>
+                <w:iCs/>
+              </w:rPr>
+              <w:t xml:space="preserve">for</w:t>
+            </w:r>
+            <w:r>
+              <w:rPr>
+                <w:i/>
+                <w:iCs/>
+              </w:rPr>
+              <w:t xml:space="preserve"> </w:t>
+            </w:r>
+            <w:r>
+              <w:rPr>
+                <w:i/>
+                <w:iCs/>
+              </w:rPr>
+              <w:t xml:space="preserve">Appellant</w:t>
+            </w:r>
+          </w:p>
+          <w:p>
+            <w:pPr>
+              <w:spacing w:before="0" w:after="0" w:line="322" w:lineRule="exact"/>
+              <w:ind w:left="4608" w:firstLine="0"/>
+              <w:jc w:val="left"/>
+            </w:pPr>
+            <w:r>
+              <w:t xml:space="preserve">304</w:t>
+            </w:r>
+            <w:r>
+              <w:t xml:space="preserve"> </w:t>
+            </w:r>
+            <w:r>
+              <w:t xml:space="preserve">N.</w:t>
+            </w:r>
+            <w:r>
+              <w:t xml:space="preserve"> </w:t>
+            </w:r>
+            <w:r>
+              <w:t xml:space="preserve">Ashley</w:t>
+            </w:r>
+            <w:r>
+              <w:t xml:space="preserve"> </w:t>
+            </w:r>
+            <w:r>
+              <w:t xml:space="preserve">St.</w:t>
+            </w:r>
+          </w:p>
+          <w:p>
+            <w:pPr>
+              <w:spacing w:before="0" w:after="0" w:line="322" w:lineRule="exact"/>
+              <w:ind w:left="4608" w:firstLine="0"/>
+              <w:jc w:val="left"/>
+            </w:pPr>
+            <w:r>
+              <w:t xml:space="preserve">Valdosta,</w:t>
+            </w:r>
+            <w:r>
+              <w:t xml:space="preserve"> </w:t>
+            </w:r>
+            <w:r>
+              <w:t xml:space="preserve">GA</w:t>
+            </w:r>
+            <w:r>
+              <w:t xml:space="preserve"> </w:t>
+            </w:r>
+            <w:r>
+              <w:t xml:space="preserve">31601</w:t>
+            </w:r>
+          </w:p>
+          <w:p>
+            <w:pPr>
+              <w:spacing w:before="0" w:after="0" w:line="322" w:lineRule="exact"/>
+              <w:ind w:left="4608" w:firstLine="0"/>
+              <w:jc w:val="left"/>
+            </w:pPr>
+            <w:r>
+              <w:t xml:space="preserve">(229)</w:t>
+            </w:r>
+            <w:r>
+              <w:t xml:space="preserve"> </w:t>
+            </w:r>
+            <w:r>
+              <w:t xml:space="preserve">588</w:t>
+              <w:noBreakHyphen/>
+              <w:t xml:space="preserve">2608</w:t>
+            </w:r>
+          </w:p>
+          <w:p>
+            <w:pPr>
+              <w:spacing w:before="0" w:after="0" w:line="322" w:lineRule="exact"/>
+              <w:ind w:left="4608" w:firstLine="0"/>
+              <w:jc w:val="left"/>
+            </w:pPr>
+            <w:r>
+              <w:t xml:space="preserve">petermanlawoffice@yahoo.com</w:t>
+            </w:r>
+          </w:p>
+          <w:p>
+            <w:pPr>
+              <w:spacing w:before="0" w:after="0" w:line="322" w:lineRule="exact"/>
+              <w:ind w:left="4608" w:firstLine="0"/>
+              <w:jc w:val="left"/>
+            </w:pPr>
+            <w:r>
+              <w:t xml:space="preserve">mburke.petermanlaw@gmail.com</w:t>
+            </w:r>
+          </w:p>
+          <w:p>
+            <w:pPr>
+              <w:spacing w:before="0" w:after="0" w:line="322" w:lineRule="exact"/>
+              <w:ind w:left="4608" w:firstLine="0"/>
+              <w:jc w:val="left"/>
+            </w:pPr>
+            <w:r>
+              <w:t xml:space="preserve">sddelk.petermanlaw@gmail.com</w:t>
+            </w:r>
+          </w:p>
+        </w:tc>
+      </w:tr>
+    </w:tbl>
+    <w:p>
+      <w:pPr>
+        <w:pageBreakBefore/>
+        <w:spacing w:before="0" w:after="0" w:line="1" w:lineRule="exact"/>
+      </w:pPr>
     </w:p>
     <w:p>
       <w:pPr>
         <w:keepNext/>
         <w:keepLines/>
-        <w:spacing w:before="0" w:after="0" w:line="644" w:lineRule="exact"/>
-        <w:ind w:left="0" w:firstLine="720"/>
-      </w:pPr>
-      <w:r>
-        <w:t xml:space="preserve">This</w:t>
-      </w:r>
-      <w:r>
-        <w:t xml:space="preserve"> </w:t>
-      </w:r>
-      <w:r>
-        <w:t xml:space="preserve">submission</w:t>
-      </w:r>
-      <w:r>
-        <w:t xml:space="preserve"> </w:t>
-      </w:r>
-      <w:r>
-        <w:t xml:space="preserve">does</w:t>
-      </w:r>
-      <w:r>
-        <w:t xml:space="preserve"> </w:t>
-      </w:r>
-      <w:r>
-        <w:t xml:space="preserve">not</w:t>
-      </w:r>
-      <w:r>
-        <w:t xml:space="preserve"> </w:t>
-      </w:r>
-      <w:r>
-        <w:t xml:space="preserve">exceed</w:t>
-      </w:r>
-      <w:r>
-        <w:t xml:space="preserve"> </w:t>
-      </w:r>
-      <w:r>
-        <w:t xml:space="preserve">the</w:t>
-      </w:r>
-      <w:r>
-        <w:t xml:space="preserve"> </w:t>
-      </w:r>
-      <w:r>
-        <w:t xml:space="preserve">word</w:t>
-      </w:r>
-      <w:r>
-        <w:t xml:space="preserve"> </w:t>
-      </w:r>
-      <w:r>
-        <w:t xml:space="preserve">count</w:t>
-      </w:r>
-      <w:r>
-        <w:t xml:space="preserve"> </w:t>
-      </w:r>
-      <w:r>
-        <w:t xml:space="preserve">limit</w:t>
-      </w:r>
-      <w:r>
-        <w:t xml:space="preserve"> </w:t>
-      </w:r>
-      <w:r>
-        <w:t xml:space="preserve">imposed</w:t>
-      </w:r>
-      <w:r>
-        <w:t xml:space="preserve"> </w:t>
-      </w:r>
-      <w:r>
-        <w:t xml:space="preserve">by</w:t>
-      </w:r>
-      <w:r>
-        <w:t xml:space="preserve"> </w:t>
-      </w:r>
-      <w:r>
-        <w:t xml:space="preserve">Rule</w:t>
-      </w:r>
-      <w:r>
-        <w:t xml:space="preserve"> </w:t>
-      </w:r>
-      <w:r>
-        <w:t xml:space="preserve">24.</w:t>
-      </w:r>
-    </w:p>
-    <w:p>
-      <w:pPr>
-        <w:keepNext/>
-        <w:keepLines/>
-        <w:spacing w:before="0" w:after="0" w:line="644" w:lineRule="exact"/>
-        <w:ind w:left="0" w:firstLine="720"/>
-      </w:pPr>
-      <w:r>
-        <w:t xml:space="preserve">Respectfully</w:t>
-      </w:r>
-      <w:r>
-        <w:t xml:space="preserve"> </w:t>
-      </w:r>
-      <w:r>
-        <w:t xml:space="preserve">submitted</w:t>
-      </w:r>
-      <w:r>
-        <w:t xml:space="preserve"> </w:t>
-      </w:r>
-      <w:r>
-        <w:t xml:space="preserve">this</w:t>
-      </w:r>
-      <w:r>
-        <w:t xml:space="preserve"> </w:t>
-      </w:r>
-      <w:r>
-        <w:t xml:space="preserve">26th</w:t>
-      </w:r>
-      <w:r>
-        <w:t xml:space="preserve"> </w:t>
-      </w:r>
-      <w:r>
-        <w:t xml:space="preserve">day</w:t>
-      </w:r>
-      <w:r>
-        <w:t xml:space="preserve"> </w:t>
-      </w:r>
-      <w:r>
-        <w:t xml:space="preserve">of</w:t>
-      </w:r>
-      <w:r>
-        <w:t xml:space="preserve"> </w:t>
-      </w:r>
-      <w:r>
-        <w:t xml:space="preserve">January</w:t>
-      </w:r>
-      <w:r>
-        <w:t xml:space="preserve"> </w:t>
-      </w:r>
-      <w:r>
-        <w:t xml:space="preserve">2026.</w:t>
-      </w:r>
-    </w:p>
-    <w:p>
-      <w:pPr>
-        <w:keepNext/>
-        <w:keepLines/>
-        <w:spacing w:before="160" w:after="0" w:line="322" w:lineRule="exact"/>
-        <w:ind w:left="4608" w:firstLine="0"/>
-      </w:pPr>
-      <w:r>
-        <w:rPr>
-          <w:b/>
-          <w:bCs/>
-        </w:rPr>
-        <w:t xml:space="preserve">JODY</w:t>
-      </w:r>
-      <w:r>
-        <w:rPr>
-          <w:b/>
-          <w:bCs/>
-        </w:rPr>
-        <w:t xml:space="preserve"> </w:t>
-      </w:r>
-      <w:r>
-        <w:rPr>
-          <w:b/>
-          <w:bCs/>
-        </w:rPr>
-        <w:t xml:space="preserve">D.</w:t>
-      </w:r>
-      <w:r>
-        <w:rPr>
-          <w:b/>
-          <w:bCs/>
-        </w:rPr>
-        <w:t xml:space="preserve"> </w:t>
-      </w:r>
-      <w:r>
-        <w:rPr>
-          <w:b/>
-          <w:bCs/>
-        </w:rPr>
-        <w:t xml:space="preserve">PETERMAN,</w:t>
-      </w:r>
-      <w:r>
-        <w:rPr>
-          <w:b/>
-          <w:bCs/>
-        </w:rPr>
-        <w:t xml:space="preserve"> </w:t>
-      </w:r>
-      <w:r>
-        <w:rPr>
-          <w:b/>
-          <w:bCs/>
-        </w:rPr>
-        <w:t xml:space="preserve">LLC</w:t>
-      </w:r>
-    </w:p>
-    <w:p>
-      <w:pPr>
-        <w:keepNext/>
-        <w:keepLines/>
-        <w:spacing w:before="240" w:after="0" w:line="322" w:lineRule="exact"/>
-        <w:ind w:left="4608" w:firstLine="0"/>
-      </w:pPr>
-      <w:r>
-        <w:rPr>
-          <w:u w:val="single"/>
-        </w:rPr>
-        <w:t xml:space="preserve">/s/</w:t>
-      </w:r>
-      <w:r>
-        <w:rPr>
-          <w:u w:val="single"/>
-        </w:rPr>
-        <w:t xml:space="preserve"> </w:t>
-      </w:r>
-      <w:r>
-        <w:rPr>
-          <w:i/>
-          <w:iCs/>
-          <w:u w:val="single"/>
-        </w:rPr>
-        <w:t xml:space="preserve">Jody</w:t>
-      </w:r>
-      <w:r>
-        <w:rPr>
-          <w:i/>
-          <w:iCs/>
-          <w:u w:val="single"/>
-        </w:rPr>
-        <w:t xml:space="preserve"> </w:t>
-      </w:r>
-      <w:r>
-        <w:rPr>
-          <w:i/>
-          <w:iCs/>
-          <w:u w:val="single"/>
-        </w:rPr>
-        <w:t xml:space="preserve">D.</w:t>
-      </w:r>
-      <w:r>
-        <w:rPr>
-          <w:i/>
-          <w:iCs/>
-          <w:u w:val="single"/>
-        </w:rPr>
-        <w:t xml:space="preserve"> </w:t>
-      </w:r>
-      <w:r>
-        <w:rPr>
-          <w:i/>
-          <w:iCs/>
-          <w:u w:val="single"/>
-        </w:rPr>
-        <w:t xml:space="preserve">Peterman</w:t>
-      </w:r>
-    </w:p>
-    <w:p>
-      <w:pPr>
-        <w:keepNext/>
-        <w:keepLines/>
-        <w:spacing w:before="0" w:after="0" w:line="322" w:lineRule="exact"/>
-        <w:ind w:left="4608" w:firstLine="0"/>
-      </w:pPr>
-      <w:r>
-        <w:t xml:space="preserve">Jody</w:t>
-      </w:r>
-      <w:r>
-        <w:t xml:space="preserve"> </w:t>
-      </w:r>
-      <w:r>
-        <w:t xml:space="preserve">D.</w:t>
-      </w:r>
-      <w:r>
-        <w:t xml:space="preserve"> </w:t>
-      </w:r>
-      <w:r>
-        <w:t xml:space="preserve">Peterman</w:t>
-      </w:r>
-    </w:p>
-    <w:p>
-      <w:pPr>
-        <w:keepNext/>
-        <w:keepLines/>
-        <w:spacing w:before="0" w:after="0" w:line="322" w:lineRule="exact"/>
-        <w:ind w:left="4608" w:firstLine="0"/>
-      </w:pPr>
-      <w:r>
-        <w:t xml:space="preserve">Georgia</w:t>
-      </w:r>
-      <w:r>
-        <w:t xml:space="preserve"> </w:t>
-      </w:r>
-      <w:r>
-        <w:t xml:space="preserve">Bar</w:t>
-      </w:r>
-      <w:r>
-        <w:t xml:space="preserve"> </w:t>
-      </w:r>
-      <w:r>
-        <w:t xml:space="preserve">No.</w:t>
-      </w:r>
-      <w:r>
-        <w:t xml:space="preserve"> </w:t>
-      </w:r>
-      <w:r>
-        <w:t xml:space="preserve">573552</w:t>
-      </w:r>
-    </w:p>
-    <w:p>
-      <w:pPr>
-        <w:keepNext/>
-        <w:keepLines/>
-        <w:spacing w:before="240" w:after="0" w:line="322" w:lineRule="exact"/>
-        <w:ind w:left="4608" w:firstLine="0"/>
-      </w:pPr>
-      <w:r>
-        <w:rPr>
-          <w:u w:val="single"/>
-        </w:rPr>
-        <w:t xml:space="preserve">/s/</w:t>
-      </w:r>
-      <w:r>
-        <w:rPr>
-          <w:u w:val="single"/>
-        </w:rPr>
-        <w:t xml:space="preserve"> </w:t>
-      </w:r>
-      <w:r>
-        <w:rPr>
-          <w:i/>
-          <w:iCs/>
-          <w:u w:val="single"/>
-        </w:rPr>
-        <w:t xml:space="preserve">T.</w:t>
-      </w:r>
-      <w:r>
-        <w:rPr>
-          <w:i/>
-          <w:iCs/>
-          <w:u w:val="single"/>
-        </w:rPr>
-        <w:t xml:space="preserve"> </w:t>
-      </w:r>
-      <w:r>
-        <w:rPr>
-          <w:i/>
-          <w:iCs/>
-          <w:u w:val="single"/>
-        </w:rPr>
-        <w:t xml:space="preserve">Michael</w:t>
-      </w:r>
-      <w:r>
-        <w:rPr>
-          <w:i/>
-          <w:iCs/>
-          <w:u w:val="single"/>
-        </w:rPr>
-        <w:t xml:space="preserve"> </w:t>
-      </w:r>
-      <w:r>
-        <w:rPr>
-          <w:i/>
-          <w:iCs/>
-          <w:u w:val="single"/>
-        </w:rPr>
-        <w:t xml:space="preserve">Burke,</w:t>
-      </w:r>
-      <w:r>
-        <w:rPr>
-          <w:i/>
-          <w:iCs/>
-          <w:u w:val="single"/>
-        </w:rPr>
-        <w:t xml:space="preserve"> </w:t>
-      </w:r>
-      <w:r>
-        <w:rPr>
-          <w:i/>
-          <w:iCs/>
-          <w:u w:val="single"/>
-        </w:rPr>
-        <w:t xml:space="preserve">Jr.</w:t>
-      </w:r>
-    </w:p>
-    <w:p>
-      <w:pPr>
-        <w:keepNext/>
-        <w:keepLines/>
-        <w:spacing w:before="0" w:after="0" w:line="322" w:lineRule="exact"/>
-        <w:ind w:left="4608" w:firstLine="0"/>
-      </w:pPr>
-      <w:r>
-        <w:t xml:space="preserve">T.</w:t>
-      </w:r>
-      <w:r>
-        <w:t xml:space="preserve"> </w:t>
-      </w:r>
-      <w:r>
-        <w:t xml:space="preserve">Michael</w:t>
-      </w:r>
-      <w:r>
-        <w:t xml:space="preserve"> </w:t>
-      </w:r>
-      <w:r>
-        <w:t xml:space="preserve">Burke,</w:t>
-      </w:r>
-      <w:r>
-        <w:t xml:space="preserve"> </w:t>
-      </w:r>
-      <w:r>
-        <w:t xml:space="preserve">Jr.</w:t>
-      </w:r>
-    </w:p>
-    <w:p>
-      <w:pPr>
-        <w:keepNext/>
-        <w:keepLines/>
-        <w:spacing w:before="0" w:after="0" w:line="322" w:lineRule="exact"/>
-        <w:ind w:left="4608" w:firstLine="0"/>
-      </w:pPr>
-      <w:r>
-        <w:t xml:space="preserve">Georgia</w:t>
-      </w:r>
-      <w:r>
-        <w:t xml:space="preserve"> </w:t>
-      </w:r>
-      <w:r>
-        <w:t xml:space="preserve">Bar</w:t>
-      </w:r>
-      <w:r>
-        <w:t xml:space="preserve"> </w:t>
-      </w:r>
-      <w:r>
-        <w:t xml:space="preserve">No.</w:t>
-      </w:r>
-      <w:r>
-        <w:t xml:space="preserve"> </w:t>
-      </w:r>
-      <w:r>
-        <w:t xml:space="preserve">106106</w:t>
-      </w:r>
-    </w:p>
-    <w:p>
-      <w:pPr>
-        <w:keepNext/>
-        <w:keepLines/>
-        <w:spacing w:before="240" w:after="0" w:line="322" w:lineRule="exact"/>
-        <w:ind w:left="4608" w:firstLine="0"/>
-      </w:pPr>
-      <w:r>
-        <w:rPr>
-          <w:u w:val="single"/>
-        </w:rPr>
-        <w:t xml:space="preserve">/s/</w:t>
-      </w:r>
-      <w:r>
-        <w:rPr>
-          <w:u w:val="single"/>
-        </w:rPr>
-        <w:t xml:space="preserve"> </w:t>
-      </w:r>
-      <w:r>
-        <w:rPr>
-          <w:i/>
-          <w:iCs/>
-          <w:u w:val="single"/>
-        </w:rPr>
-        <w:t xml:space="preserve">Stephen</w:t>
-      </w:r>
-      <w:r>
-        <w:rPr>
-          <w:i/>
-          <w:iCs/>
-          <w:u w:val="single"/>
-        </w:rPr>
-        <w:t xml:space="preserve"> </w:t>
-      </w:r>
-      <w:r>
-        <w:rPr>
-          <w:i/>
-          <w:iCs/>
-          <w:u w:val="single"/>
-        </w:rPr>
-        <w:t xml:space="preserve">D.</w:t>
-      </w:r>
-      <w:r>
-        <w:rPr>
-          <w:i/>
-          <w:iCs/>
-          <w:u w:val="single"/>
-        </w:rPr>
-        <w:t xml:space="preserve"> </w:t>
-      </w:r>
-      <w:r>
-        <w:rPr>
-          <w:i/>
-          <w:iCs/>
-          <w:u w:val="single"/>
-        </w:rPr>
-        <w:t xml:space="preserve">Delk</w:t>
-      </w:r>
-    </w:p>
-    <w:p>
-      <w:pPr>
-        <w:keepNext/>
-        <w:keepLines/>
-        <w:spacing w:before="0" w:after="0" w:line="322" w:lineRule="exact"/>
-        <w:ind w:left="4608" w:firstLine="0"/>
-      </w:pPr>
-      <w:r>
-        <w:t xml:space="preserve">Stephen</w:t>
-      </w:r>
-      <w:r>
-        <w:t xml:space="preserve"> </w:t>
-      </w:r>
-      <w:r>
-        <w:t xml:space="preserve">D.</w:t>
-      </w:r>
-      <w:r>
-        <w:t xml:space="preserve"> </w:t>
-      </w:r>
-      <w:r>
-        <w:t xml:space="preserve">Delk</w:t>
-      </w:r>
-    </w:p>
-    <w:p>
-      <w:pPr>
-        <w:keepNext/>
-        <w:keepLines/>
-        <w:spacing w:before="0" w:after="0" w:line="322" w:lineRule="exact"/>
-        <w:ind w:left="4608" w:firstLine="0"/>
-      </w:pPr>
-      <w:r>
-        <w:t xml:space="preserve">Georgia</w:t>
-      </w:r>
-      <w:r>
-        <w:t xml:space="preserve"> </w:t>
-      </w:r>
-      <w:r>
-        <w:t xml:space="preserve">Bar</w:t>
-      </w:r>
-      <w:r>
-        <w:t xml:space="preserve"> </w:t>
-      </w:r>
-      <w:r>
-        <w:t xml:space="preserve">No.</w:t>
-      </w:r>
-      <w:r>
-        <w:t xml:space="preserve"> </w:t>
-      </w:r>
-      <w:r>
-        <w:t xml:space="preserve">448395</w:t>
-      </w:r>
-    </w:p>
-    <w:p>
-      <w:pPr>
-        <w:keepNext/>
-        <w:keepLines/>
-        <w:spacing w:before="160" w:after="0" w:line="322" w:lineRule="exact"/>
-        <w:ind w:left="4608" w:firstLine="0"/>
-      </w:pPr>
-      <w:r>
-        <w:rPr>
-          <w:i/>
-          <w:iCs/>
-        </w:rPr>
-        <w:t xml:space="preserve">Attorneys</w:t>
-      </w:r>
-      <w:r>
-        <w:rPr>
-          <w:i/>
-          <w:iCs/>
-        </w:rPr>
-        <w:t xml:space="preserve"> </w:t>
-      </w:r>
-      <w:r>
-        <w:rPr>
-          <w:i/>
-          <w:iCs/>
-        </w:rPr>
-        <w:t xml:space="preserve">for</w:t>
-      </w:r>
-      <w:r>
-        <w:rPr>
-          <w:i/>
-          <w:iCs/>
-        </w:rPr>
-        <w:t xml:space="preserve"> </w:t>
-      </w:r>
-      <w:r>
-        <w:rPr>
-          <w:i/>
-          <w:iCs/>
-        </w:rPr>
-        <w:t xml:space="preserve">Appellant</w:t>
-      </w:r>
-    </w:p>
-    <w:p>
-      <w:pPr>
-        <w:keepNext/>
-        <w:keepLines/>
-        <w:spacing w:before="0" w:after="0" w:line="322" w:lineRule="exact"/>
-        <w:ind w:left="4608" w:firstLine="0"/>
-      </w:pPr>
-      <w:r>
-        <w:t xml:space="preserve">304</w:t>
-      </w:r>
-      <w:r>
-        <w:t xml:space="preserve"> </w:t>
-      </w:r>
-      <w:r>
-        <w:t xml:space="preserve">N.</w:t>
-      </w:r>
-      <w:r>
-        <w:t xml:space="preserve"> </w:t>
-      </w:r>
-      <w:r>
-        <w:t xml:space="preserve">Ashley</w:t>
-      </w:r>
-      <w:r>
-        <w:t xml:space="preserve"> </w:t>
-      </w:r>
-      <w:r>
-        <w:t xml:space="preserve">St.</w:t>
-      </w:r>
-    </w:p>
-    <w:p>
-      <w:pPr>
-        <w:keepNext/>
-        <w:keepLines/>
-        <w:spacing w:before="0" w:after="0" w:line="322" w:lineRule="exact"/>
-        <w:ind w:left="4608" w:firstLine="0"/>
-      </w:pPr>
-      <w:r>
-        <w:t xml:space="preserve">Valdosta,</w:t>
-      </w:r>
-      <w:r>
-        <w:t xml:space="preserve"> </w:t>
-      </w:r>
-      <w:r>
-        <w:t xml:space="preserve">GA</w:t>
-      </w:r>
-      <w:r>
-        <w:t xml:space="preserve"> </w:t>
-      </w:r>
-      <w:r>
-        <w:t xml:space="preserve">31601</w:t>
-      </w:r>
-    </w:p>
-    <w:p>
-      <w:pPr>
-        <w:keepNext/>
-        <w:keepLines/>
-        <w:spacing w:before="0" w:after="0" w:line="322" w:lineRule="exact"/>
-        <w:ind w:left="4608" w:firstLine="0"/>
-      </w:pPr>
-      <w:r>
-        <w:t xml:space="preserve">(229)</w:t>
-      </w:r>
-      <w:r>
-        <w:t xml:space="preserve"> </w:t>
-      </w:r>
-      <w:r>
-        <w:t xml:space="preserve">588</w:t>
-      </w:r>
-      <w:r>
-        <w:noBreakHyphen/>
-      </w:r>
-      <w:r>
-        <w:t xml:space="preserve">2608</w:t>
-      </w:r>
-    </w:p>
-    <w:p>
-      <w:pPr>
-        <w:keepNext/>
-        <w:keepLines/>
-        <w:spacing w:before="0" w:after="0" w:line="322" w:lineRule="exact"/>
-        <w:ind w:left="4608" w:firstLine="0"/>
-      </w:pPr>
-      <w:r>
-        <w:t xml:space="preserve">petermanlawoffice@yahoo.com</w:t>
-      </w:r>
-    </w:p>
-    <w:p>
-      <w:pPr>
-        <w:keepNext/>
-        <w:keepLines/>
-        <w:spacing w:before="0" w:after="0" w:line="322" w:lineRule="exact"/>
-        <w:ind w:left="4608" w:firstLine="0"/>
-      </w:pPr>
-      <w:r>
-        <w:t xml:space="preserve">mburke.petermanlaw@gmail.com</w:t>
-      </w:r>
-    </w:p>
-    <w:p>
-      <w:pPr>
-        <w:keepLines/>
-        <w:spacing w:before="0" w:after="0" w:line="322" w:lineRule="exact"/>
-        <w:ind w:left="4608" w:firstLine="0"/>
-      </w:pPr>
-      <w:r>
-        <w:t xml:space="preserve">sddelk.petermanlaw@gmail.com</w:t>
-      </w:r>
-    </w:p>
-    <w:p>
-      <w:pPr>
-        <w:keepNext/>
-        <w:keepLines/>
-        <w:pageBreakBefore/>
         <w:spacing w:before="0" w:after="320" w:line="322" w:lineRule="exact"/>
         <w:ind w:left="0" w:firstLine="0"/>
         <w:jc w:val="center"/>
@@ -4898,6 +5007,7 @@
       <w:pPr>
         <w:spacing w:before="0" w:after="0" w:line="644" w:lineRule="exact"/>
         <w:ind w:left="0" w:firstLine="720"/>
+        <w:jc w:val="left"/>
       </w:pPr>
       <w:r>
         <w:t xml:space="preserve">I</w:t>
@@ -5001,881 +5111,1103 @@
     </w:p>
     <w:p>
       <w:pPr>
-        <w:keepNext/>
-        <w:keepLines/>
-        <w:spacing w:before="322" w:after="0" w:line="322" w:lineRule="exact"/>
-        <w:ind w:left="1440" w:firstLine="0"/>
-      </w:pPr>
-      <w:r>
-        <w:t xml:space="preserve">W.</w:t>
-      </w:r>
-      <w:r>
-        <w:t xml:space="preserve"> </w:t>
-      </w:r>
-      <w:r>
-        <w:t xml:space="preserve">Justin</w:t>
-      </w:r>
-      <w:r>
-        <w:t xml:space="preserve"> </w:t>
-      </w:r>
-      <w:r>
-        <w:t xml:space="preserve">Purvis,</w:t>
-      </w:r>
-      <w:r>
-        <w:t xml:space="preserve"> </w:t>
-      </w:r>
-      <w:r>
-        <w:t xml:space="preserve">Esq.</w:t>
-      </w:r>
-    </w:p>
-    <w:p>
-      <w:pPr>
-        <w:keepNext/>
-        <w:keepLines/>
         <w:spacing w:before="0" w:after="0" w:line="322" w:lineRule="exact"/>
-        <w:ind w:left="1440" w:firstLine="0"/>
-      </w:pPr>
-      <w:r>
-        <w:t xml:space="preserve">Lance</w:t>
-      </w:r>
-      <w:r>
-        <w:t xml:space="preserve"> </w:t>
-      </w:r>
-      <w:r>
-        <w:t xml:space="preserve">D.</w:t>
-      </w:r>
-      <w:r>
-        <w:t xml:space="preserve"> </w:t>
-      </w:r>
-      <w:r>
-        <w:t xml:space="preserve">Stephens,</w:t>
-      </w:r>
-      <w:r>
-        <w:t xml:space="preserve"> </w:t>
-      </w:r>
-      <w:r>
-        <w:t xml:space="preserve">Esq.</w:t>
-      </w:r>
-    </w:p>
-    <w:p>
-      <w:pPr>
-        <w:keepNext/>
-        <w:keepLines/>
+      </w:pPr>
+    </w:p>
+    <w:tbl>
+      <w:tblPr>
+        <w:tblW w:w="9360" w:type="dxa"/>
+        <w:tblLayout w:type="fixed"/>
+        <w:tblCellMar>
+          <w:top w:w="0" w:type="dxa"/>
+          <w:left w:w="0" w:type="dxa"/>
+          <w:bottom w:w="0" w:type="dxa"/>
+          <w:right w:w="0" w:type="dxa"/>
+        </w:tblCellMar>
+        <w:tblLook w:val="0000" w:firstRow="0" w:lastRow="0" w:firstColumn="0" w:lastColumn="0" w:noHBand="0" w:noVBand="0"/>
+      </w:tblPr>
+      <w:tblGrid>
+        <w:gridCol w:w="9360"/>
+      </w:tblGrid>
+      <w:tr>
+        <w:trPr>
+          <w:cantSplit/>
+        </w:trPr>
+        <w:tc>
+          <w:tcPr>
+            <w:tcW w:w="9360" w:type="dxa"/>
+          </w:tcPr>
+          <w:p>
+            <w:pPr>
+              <w:spacing w:before="0" w:after="0" w:line="322" w:lineRule="exact"/>
+              <w:ind w:left="1440" w:firstLine="0"/>
+              <w:jc w:val="left"/>
+            </w:pPr>
+            <w:r>
+              <w:t xml:space="preserve">W.</w:t>
+            </w:r>
+            <w:r>
+              <w:t xml:space="preserve"> </w:t>
+            </w:r>
+            <w:r>
+              <w:t xml:space="preserve">Justin</w:t>
+            </w:r>
+            <w:r>
+              <w:t xml:space="preserve"> </w:t>
+            </w:r>
+            <w:r>
+              <w:t xml:space="preserve">Purvis,</w:t>
+            </w:r>
+            <w:r>
+              <w:t xml:space="preserve"> </w:t>
+            </w:r>
+            <w:r>
+              <w:t xml:space="preserve">Esq.</w:t>
+            </w:r>
+          </w:p>
+          <w:p>
+            <w:pPr>
+              <w:spacing w:before="0" w:after="0" w:line="322" w:lineRule="exact"/>
+              <w:ind w:left="1440" w:firstLine="0"/>
+              <w:jc w:val="left"/>
+            </w:pPr>
+            <w:r>
+              <w:t xml:space="preserve">Lance</w:t>
+            </w:r>
+            <w:r>
+              <w:t xml:space="preserve"> </w:t>
+            </w:r>
+            <w:r>
+              <w:t xml:space="preserve">D.</w:t>
+            </w:r>
+            <w:r>
+              <w:t xml:space="preserve"> </w:t>
+            </w:r>
+            <w:r>
+              <w:t xml:space="preserve">Stephens,</w:t>
+            </w:r>
+            <w:r>
+              <w:t xml:space="preserve"> </w:t>
+            </w:r>
+            <w:r>
+              <w:t xml:space="preserve">Esq.</w:t>
+            </w:r>
+          </w:p>
+          <w:p>
+            <w:pPr>
+              <w:spacing w:before="0" w:after="0" w:line="322" w:lineRule="exact"/>
+              <w:ind w:left="1440" w:firstLine="0"/>
+              <w:jc w:val="left"/>
+            </w:pPr>
+            <w:r>
+              <w:t xml:space="preserve">YOUNG,</w:t>
+            </w:r>
+            <w:r>
+              <w:t xml:space="preserve"> </w:t>
+            </w:r>
+            <w:r>
+              <w:t xml:space="preserve">THAGARD,</w:t>
+            </w:r>
+            <w:r>
+              <w:t xml:space="preserve"> </w:t>
+            </w:r>
+            <w:r>
+              <w:t xml:space="preserve">HOFFMAN,</w:t>
+            </w:r>
+            <w:r>
+              <w:t xml:space="preserve"> </w:t>
+            </w:r>
+            <w:r>
+              <w:t xml:space="preserve">LLP</w:t>
+            </w:r>
+          </w:p>
+          <w:p>
+            <w:pPr>
+              <w:spacing w:before="0" w:after="0" w:line="322" w:lineRule="exact"/>
+              <w:ind w:left="1440" w:firstLine="0"/>
+              <w:jc w:val="left"/>
+            </w:pPr>
+            <w:r>
+              <w:t xml:space="preserve">P.O.</w:t>
+            </w:r>
+            <w:r>
+              <w:t xml:space="preserve"> </w:t>
+            </w:r>
+            <w:r>
+              <w:t xml:space="preserve">Box</w:t>
+            </w:r>
+            <w:r>
+              <w:t xml:space="preserve"> </w:t>
+            </w:r>
+            <w:r>
+              <w:t xml:space="preserve">3007</w:t>
+            </w:r>
+          </w:p>
+          <w:p>
+            <w:pPr>
+              <w:spacing w:before="0" w:after="0" w:line="322" w:lineRule="exact"/>
+              <w:ind w:left="1440" w:firstLine="0"/>
+              <w:jc w:val="left"/>
+            </w:pPr>
+            <w:r>
+              <w:t xml:space="preserve">Valdosta,</w:t>
+            </w:r>
+            <w:r>
+              <w:t xml:space="preserve"> </w:t>
+            </w:r>
+            <w:r>
+              <w:t xml:space="preserve">GA</w:t>
+            </w:r>
+            <w:r>
+              <w:t xml:space="preserve"> </w:t>
+            </w:r>
+            <w:r>
+              <w:t xml:space="preserve">31604</w:t>
+              <w:noBreakHyphen/>
+              <w:t xml:space="preserve">3007</w:t>
+            </w:r>
+          </w:p>
+          <w:p>
+            <w:pPr>
+              <w:spacing w:before="0" w:after="0" w:line="322" w:lineRule="exact"/>
+              <w:ind w:left="1440" w:firstLine="0"/>
+              <w:jc w:val="left"/>
+            </w:pPr>
+            <w:r>
+              <w:t xml:space="preserve">justinpurvis@youngthagard.com</w:t>
+            </w:r>
+          </w:p>
+          <w:p>
+            <w:pPr>
+              <w:spacing w:before="0" w:after="0" w:line="322" w:lineRule="exact"/>
+              <w:ind w:left="1440" w:firstLine="0"/>
+              <w:jc w:val="left"/>
+            </w:pPr>
+            <w:r>
+              <w:t xml:space="preserve">lancestephens@youngthagard.com</w:t>
+            </w:r>
+          </w:p>
+        </w:tc>
+      </w:tr>
+    </w:tbl>
+    <w:p>
+      <w:pPr>
         <w:spacing w:before="0" w:after="0" w:line="322" w:lineRule="exact"/>
-        <w:ind w:left="1440" w:firstLine="0"/>
-      </w:pPr>
-      <w:r>
-        <w:t xml:space="preserve">YOUNG,</w:t>
-      </w:r>
-      <w:r>
-        <w:t xml:space="preserve"> </w:t>
-      </w:r>
-      <w:r>
-        <w:t xml:space="preserve">THAGARD,</w:t>
-      </w:r>
-      <w:r>
-        <w:t xml:space="preserve"> </w:t>
-      </w:r>
-      <w:r>
-        <w:t xml:space="preserve">HOFFMAN,</w:t>
-      </w:r>
-      <w:r>
-        <w:t xml:space="preserve"> </w:t>
-      </w:r>
-      <w:r>
-        <w:t xml:space="preserve">LLP</w:t>
-      </w:r>
-    </w:p>
-    <w:p>
-      <w:pPr>
-        <w:keepNext/>
-        <w:keepLines/>
-        <w:spacing w:before="0" w:after="0" w:line="322" w:lineRule="exact"/>
-        <w:ind w:left="1440" w:firstLine="0"/>
-      </w:pPr>
-      <w:r>
-        <w:t xml:space="preserve">P.O.</w:t>
-      </w:r>
-      <w:r>
-        <w:t xml:space="preserve"> </w:t>
-      </w:r>
-      <w:r>
-        <w:t xml:space="preserve">Box</w:t>
-      </w:r>
-      <w:r>
-        <w:t xml:space="preserve"> </w:t>
-      </w:r>
-      <w:r>
-        <w:t xml:space="preserve">3007</w:t>
-      </w:r>
-    </w:p>
-    <w:p>
-      <w:pPr>
-        <w:keepNext/>
-        <w:keepLines/>
-        <w:spacing w:before="0" w:after="0" w:line="322" w:lineRule="exact"/>
-        <w:ind w:left="1440" w:firstLine="0"/>
-      </w:pPr>
-      <w:r>
-        <w:t xml:space="preserve">Valdosta,</w:t>
-      </w:r>
-      <w:r>
-        <w:t xml:space="preserve"> </w:t>
-      </w:r>
-      <w:r>
-        <w:t xml:space="preserve">GA</w:t>
-      </w:r>
-      <w:r>
-        <w:t xml:space="preserve"> </w:t>
-      </w:r>
-      <w:r>
-        <w:t xml:space="preserve">31604</w:t>
-      </w:r>
-      <w:r>
-        <w:noBreakHyphen/>
-      </w:r>
-      <w:r>
-        <w:t xml:space="preserve">3007</w:t>
-      </w:r>
-    </w:p>
-    <w:p>
-      <w:pPr>
-        <w:keepNext/>
-        <w:keepLines/>
-        <w:spacing w:before="0" w:after="0" w:line="322" w:lineRule="exact"/>
-        <w:ind w:left="1440" w:firstLine="0"/>
-      </w:pPr>
-      <w:r>
-        <w:t xml:space="preserve">justinpurvis@youngthagard.com</w:t>
-      </w:r>
-    </w:p>
-    <w:p>
-      <w:pPr>
-        <w:keepLines/>
-        <w:spacing w:before="0" w:after="322" w:line="322" w:lineRule="exact"/>
-        <w:ind w:left="1440" w:firstLine="0"/>
-      </w:pPr>
-      <w:r>
-        <w:t xml:space="preserve">lancestephens@youngthagard.com</w:t>
-      </w:r>
-    </w:p>
-    <w:p>
-      <w:pPr>
-        <w:spacing w:before="0" w:after="0" w:line="644" w:lineRule="exact"/>
-        <w:ind w:left="0" w:firstLine="720"/>
-      </w:pPr>
-      <w:r>
-        <w:t xml:space="preserve">by</w:t>
-      </w:r>
-      <w:r>
-        <w:t xml:space="preserve"> </w:t>
-      </w:r>
-      <w:r>
-        <w:t xml:space="preserve">sending</w:t>
-      </w:r>
-      <w:r>
-        <w:t xml:space="preserve"> </w:t>
-      </w:r>
-      <w:r>
-        <w:t xml:space="preserve">it</w:t>
-      </w:r>
-      <w:r>
-        <w:t xml:space="preserve"> </w:t>
-      </w:r>
-      <w:r>
-        <w:t xml:space="preserve">via</w:t>
-      </w:r>
-      <w:r>
-        <w:t xml:space="preserve"> </w:t>
-      </w:r>
-      <w:r>
-        <w:t xml:space="preserve">electronic</w:t>
-      </w:r>
-      <w:r>
-        <w:t xml:space="preserve"> </w:t>
-      </w:r>
-      <w:r>
-        <w:t xml:space="preserve">mail</w:t>
-      </w:r>
-      <w:r>
-        <w:t xml:space="preserve"> </w:t>
-      </w:r>
-      <w:r>
-        <w:t xml:space="preserve">to</w:t>
-      </w:r>
-      <w:r>
-        <w:t xml:space="preserve"> </w:t>
-      </w:r>
-      <w:r>
-        <w:t xml:space="preserve">the</w:t>
-      </w:r>
-      <w:r>
-        <w:t xml:space="preserve"> </w:t>
-      </w:r>
-      <w:r>
-        <w:t xml:space="preserve">address</w:t>
-      </w:r>
-      <w:r>
-        <w:t xml:space="preserve"> </w:t>
-      </w:r>
-      <w:r>
-        <w:t xml:space="preserve">above</w:t>
-      </w:r>
-      <w:r>
-        <w:t xml:space="preserve"> </w:t>
-      </w:r>
-      <w:r>
-        <w:t xml:space="preserve">pursuant</w:t>
-      </w:r>
-      <w:r>
-        <w:t xml:space="preserve"> </w:t>
-      </w:r>
-      <w:r>
-        <w:t xml:space="preserve">to</w:t>
-      </w:r>
-      <w:r>
-        <w:t xml:space="preserve"> </w:t>
-      </w:r>
-      <w:r>
-        <w:t xml:space="preserve">agreement</w:t>
-      </w:r>
-      <w:r>
-        <w:t xml:space="preserve"> </w:t>
-      </w:r>
-      <w:r>
-        <w:t xml:space="preserve">of</w:t>
-      </w:r>
-      <w:r>
-        <w:t xml:space="preserve"> </w:t>
-      </w:r>
-      <w:r>
-        <w:t xml:space="preserve">counsel.</w:t>
-      </w:r>
-      <w:r>
-        <w:t xml:space="preserve"> </w:t>
-      </w:r>
-      <w:r>
-        <w:t xml:space="preserve">I</w:t>
-      </w:r>
-      <w:r>
-        <w:t xml:space="preserve"> </w:t>
-      </w:r>
-      <w:r>
-        <w:t xml:space="preserve">certify</w:t>
-      </w:r>
-      <w:r>
-        <w:t xml:space="preserve"> </w:t>
-      </w:r>
-      <w:r>
-        <w:t xml:space="preserve">that</w:t>
-      </w:r>
-      <w:r>
-        <w:t xml:space="preserve"> </w:t>
-      </w:r>
-      <w:r>
-        <w:t xml:space="preserve">there</w:t>
-      </w:r>
-      <w:r>
-        <w:t xml:space="preserve"> </w:t>
-      </w:r>
-      <w:r>
-        <w:t xml:space="preserve">is</w:t>
-      </w:r>
-      <w:r>
-        <w:t xml:space="preserve"> </w:t>
-      </w:r>
-      <w:r>
-        <w:t xml:space="preserve">a</w:t>
-      </w:r>
-      <w:r>
-        <w:t xml:space="preserve"> </w:t>
-      </w:r>
-      <w:r>
-        <w:t xml:space="preserve">prior</w:t>
-      </w:r>
-      <w:r>
-        <w:t xml:space="preserve"> </w:t>
-      </w:r>
-      <w:r>
-        <w:t xml:space="preserve">agreement</w:t>
-      </w:r>
-      <w:r>
-        <w:t xml:space="preserve"> </w:t>
-      </w:r>
-      <w:r>
-        <w:t xml:space="preserve">with</w:t>
-      </w:r>
-      <w:r>
-        <w:t xml:space="preserve"> </w:t>
-      </w:r>
-      <w:r>
-        <w:t xml:space="preserve">YOUNG,</w:t>
-      </w:r>
-      <w:r>
-        <w:t xml:space="preserve"> </w:t>
-      </w:r>
-      <w:r>
-        <w:t xml:space="preserve">THAGARD,</w:t>
-      </w:r>
-      <w:r>
-        <w:t xml:space="preserve"> </w:t>
-      </w:r>
-      <w:r>
-        <w:t xml:space="preserve">HOFFMAN,</w:t>
-      </w:r>
-      <w:r>
-        <w:t xml:space="preserve"> </w:t>
-      </w:r>
-      <w:r>
-        <w:t xml:space="preserve">LLP</w:t>
-      </w:r>
-      <w:r>
-        <w:t xml:space="preserve"> </w:t>
-      </w:r>
-      <w:r>
-        <w:t xml:space="preserve">to</w:t>
-      </w:r>
-      <w:r>
-        <w:t xml:space="preserve"> </w:t>
-      </w:r>
-      <w:r>
-        <w:t xml:space="preserve">allow</w:t>
-      </w:r>
-      <w:r>
-        <w:t xml:space="preserve"> </w:t>
-      </w:r>
-      <w:r>
-        <w:t xml:space="preserve">documents</w:t>
-      </w:r>
-      <w:r>
-        <w:t xml:space="preserve"> </w:t>
-      </w:r>
-      <w:r>
-        <w:t xml:space="preserve">in</w:t>
-      </w:r>
-      <w:r>
-        <w:t xml:space="preserve"> </w:t>
-      </w:r>
-      <w:r>
-        <w:t xml:space="preserve">a</w:t>
-      </w:r>
-      <w:r>
-        <w:t xml:space="preserve"> </w:t>
-      </w:r>
-      <w:r>
-        <w:t xml:space="preserve">PDF</w:t>
-      </w:r>
-      <w:r>
-        <w:t xml:space="preserve"> </w:t>
-      </w:r>
-      <w:r>
-        <w:t xml:space="preserve">format</w:t>
-      </w:r>
-      <w:r>
-        <w:t xml:space="preserve"> </w:t>
-      </w:r>
-      <w:r>
-        <w:t xml:space="preserve">sent</w:t>
-      </w:r>
-      <w:r>
-        <w:t xml:space="preserve"> </w:t>
-      </w:r>
-      <w:r>
-        <w:t xml:space="preserve">via</w:t>
-      </w:r>
-      <w:r>
-        <w:t xml:space="preserve"> </w:t>
-      </w:r>
-      <w:r>
-        <w:t xml:space="preserve">email</w:t>
-      </w:r>
-      <w:r>
-        <w:t xml:space="preserve"> </w:t>
-      </w:r>
-      <w:r>
-        <w:t xml:space="preserve">to</w:t>
-      </w:r>
-      <w:r>
-        <w:t xml:space="preserve"> </w:t>
-      </w:r>
-      <w:r>
-        <w:t xml:space="preserve">suffice</w:t>
-      </w:r>
-      <w:r>
-        <w:t xml:space="preserve"> </w:t>
-      </w:r>
-      <w:r>
-        <w:t xml:space="preserve">for</w:t>
-      </w:r>
-      <w:r>
-        <w:t xml:space="preserve"> </w:t>
-      </w:r>
-      <w:r>
-        <w:t xml:space="preserve">service;</w:t>
-      </w:r>
-      <w:r>
-        <w:t xml:space="preserve"> </w:t>
-      </w:r>
-      <w:r>
-        <w:t xml:space="preserve">and</w:t>
-      </w:r>
-      <w:r>
-        <w:t xml:space="preserve"> </w:t>
-      </w:r>
-      <w:r>
-        <w:t xml:space="preserve">by</w:t>
-      </w:r>
-      <w:r>
-        <w:t xml:space="preserve"> </w:t>
-      </w:r>
-      <w:r>
-        <w:t xml:space="preserve">electronically</w:t>
-      </w:r>
-      <w:r>
-        <w:t xml:space="preserve"> </w:t>
-      </w:r>
-      <w:r>
-        <w:t xml:space="preserve">filing</w:t>
-      </w:r>
-      <w:r>
-        <w:t xml:space="preserve"> </w:t>
-      </w:r>
-      <w:r>
-        <w:t xml:space="preserve">this</w:t>
-      </w:r>
-      <w:r>
-        <w:t xml:space="preserve"> </w:t>
-      </w:r>
-      <w:r>
-        <w:t xml:space="preserve">document,</w:t>
-      </w:r>
-      <w:r>
-        <w:t xml:space="preserve"> </w:t>
-      </w:r>
-      <w:r>
-        <w:t xml:space="preserve">which</w:t>
-      </w:r>
-      <w:r>
-        <w:t xml:space="preserve"> </w:t>
-      </w:r>
-      <w:r>
-        <w:t xml:space="preserve">sends</w:t>
-      </w:r>
-      <w:r>
-        <w:t xml:space="preserve"> </w:t>
-      </w:r>
-      <w:r>
-        <w:t xml:space="preserve">notice</w:t>
-      </w:r>
-      <w:r>
-        <w:t xml:space="preserve"> </w:t>
-      </w:r>
-      <w:r>
-        <w:t xml:space="preserve">via</w:t>
-      </w:r>
-      <w:r>
-        <w:t xml:space="preserve"> </w:t>
-      </w:r>
-      <w:r>
-        <w:t xml:space="preserve">that</w:t>
-      </w:r>
-      <w:r>
-        <w:t xml:space="preserve"> </w:t>
-      </w:r>
-      <w:r>
-        <w:t xml:space="preserve">system</w:t>
-      </w:r>
-      <w:r>
-        <w:t xml:space="preserve"> </w:t>
-      </w:r>
-      <w:r>
-        <w:t xml:space="preserve">to</w:t>
-      </w:r>
-      <w:r>
-        <w:t xml:space="preserve"> </w:t>
-      </w:r>
-      <w:r>
-        <w:t xml:space="preserve">all</w:t>
-      </w:r>
-      <w:r>
-        <w:t xml:space="preserve"> </w:t>
-      </w:r>
-      <w:r>
-        <w:t xml:space="preserve">parties</w:t>
-      </w:r>
-      <w:r>
-        <w:t xml:space="preserve"> </w:t>
-      </w:r>
-      <w:r>
-        <w:t xml:space="preserve">and</w:t>
-      </w:r>
-      <w:r>
-        <w:t xml:space="preserve"> </w:t>
-      </w:r>
-      <w:r>
-        <w:t xml:space="preserve">counsel.</w:t>
-      </w:r>
-      <w:r>
-        <w:t xml:space="preserve"> </w:t>
-      </w:r>
-      <w:r>
-        <w:t xml:space="preserve">This</w:t>
-      </w:r>
-      <w:r>
-        <w:t xml:space="preserve"> </w:t>
-      </w:r>
-      <w:r>
-        <w:t xml:space="preserve">26th</w:t>
-      </w:r>
-      <w:r>
-        <w:t xml:space="preserve"> </w:t>
-      </w:r>
-      <w:r>
-        <w:t xml:space="preserve">day</w:t>
-      </w:r>
-      <w:r>
-        <w:t xml:space="preserve"> </w:t>
-      </w:r>
-      <w:r>
-        <w:t xml:space="preserve">of</w:t>
-      </w:r>
-      <w:r>
-        <w:t xml:space="preserve"> </w:t>
-      </w:r>
-      <w:r>
-        <w:t xml:space="preserve">January</w:t>
-      </w:r>
-      <w:r>
-        <w:t xml:space="preserve"> </w:t>
-      </w:r>
-      <w:r>
-        <w:t xml:space="preserve">2026.</w:t>
-      </w:r>
-    </w:p>
-    <w:p>
-      <w:pPr>
-        <w:keepNext/>
-        <w:keepLines/>
-        <w:spacing w:before="160" w:after="0" w:line="322" w:lineRule="exact"/>
-        <w:ind w:left="4608" w:firstLine="0"/>
-      </w:pPr>
-      <w:r>
-        <w:rPr>
-          <w:b/>
-          <w:bCs/>
-        </w:rPr>
-        <w:t xml:space="preserve">JODY</w:t>
-      </w:r>
-      <w:r>
-        <w:rPr>
-          <w:b/>
-          <w:bCs/>
-        </w:rPr>
-        <w:t xml:space="preserve"> </w:t>
-      </w:r>
-      <w:r>
-        <w:rPr>
-          <w:b/>
-          <w:bCs/>
-        </w:rPr>
-        <w:t xml:space="preserve">D.</w:t>
-      </w:r>
-      <w:r>
-        <w:rPr>
-          <w:b/>
-          <w:bCs/>
-        </w:rPr>
-        <w:t xml:space="preserve"> </w:t>
-      </w:r>
-      <w:r>
-        <w:rPr>
-          <w:b/>
-          <w:bCs/>
-        </w:rPr>
-        <w:t xml:space="preserve">PETERMAN,</w:t>
-      </w:r>
-      <w:r>
-        <w:rPr>
-          <w:b/>
-          <w:bCs/>
-        </w:rPr>
-        <w:t xml:space="preserve"> </w:t>
-      </w:r>
-      <w:r>
-        <w:rPr>
-          <w:b/>
-          <w:bCs/>
-        </w:rPr>
-        <w:t xml:space="preserve">LLC</w:t>
-      </w:r>
-    </w:p>
-    <w:p>
-      <w:pPr>
-        <w:keepNext/>
-        <w:keepLines/>
-        <w:spacing w:before="240" w:after="0" w:line="322" w:lineRule="exact"/>
-        <w:ind w:left="4608" w:firstLine="0"/>
-      </w:pPr>
-      <w:r>
-        <w:rPr>
-          <w:u w:val="single"/>
-        </w:rPr>
-        <w:t xml:space="preserve">/s/</w:t>
-      </w:r>
-      <w:r>
-        <w:rPr>
-          <w:u w:val="single"/>
-        </w:rPr>
-        <w:t xml:space="preserve"> </w:t>
-      </w:r>
-      <w:r>
-        <w:rPr>
-          <w:i/>
-          <w:iCs/>
-          <w:u w:val="single"/>
-        </w:rPr>
-        <w:t xml:space="preserve">Jody</w:t>
-      </w:r>
-      <w:r>
-        <w:rPr>
-          <w:i/>
-          <w:iCs/>
-          <w:u w:val="single"/>
-        </w:rPr>
-        <w:t xml:space="preserve"> </w:t>
-      </w:r>
-      <w:r>
-        <w:rPr>
-          <w:i/>
-          <w:iCs/>
-          <w:u w:val="single"/>
-        </w:rPr>
-        <w:t xml:space="preserve">D.</w:t>
-      </w:r>
-      <w:r>
-        <w:rPr>
-          <w:i/>
-          <w:iCs/>
-          <w:u w:val="single"/>
-        </w:rPr>
-        <w:t xml:space="preserve"> </w:t>
-      </w:r>
-      <w:r>
-        <w:rPr>
-          <w:i/>
-          <w:iCs/>
-          <w:u w:val="single"/>
-        </w:rPr>
-        <w:t xml:space="preserve">Peterman</w:t>
-      </w:r>
-    </w:p>
-    <w:p>
-      <w:pPr>
-        <w:keepNext/>
-        <w:keepLines/>
-        <w:spacing w:before="0" w:after="0" w:line="322" w:lineRule="exact"/>
-        <w:ind w:left="4608" w:firstLine="0"/>
-      </w:pPr>
-      <w:r>
-        <w:t xml:space="preserve">Jody</w:t>
-      </w:r>
-      <w:r>
-        <w:t xml:space="preserve"> </w:t>
-      </w:r>
-      <w:r>
-        <w:t xml:space="preserve">D.</w:t>
-      </w:r>
-      <w:r>
-        <w:t xml:space="preserve"> </w:t>
-      </w:r>
-      <w:r>
-        <w:t xml:space="preserve">Peterman</w:t>
-      </w:r>
-    </w:p>
-    <w:p>
-      <w:pPr>
-        <w:keepNext/>
-        <w:keepLines/>
-        <w:spacing w:before="0" w:after="0" w:line="322" w:lineRule="exact"/>
-        <w:ind w:left="4608" w:firstLine="0"/>
-      </w:pPr>
-      <w:r>
-        <w:t xml:space="preserve">Georgia</w:t>
-      </w:r>
-      <w:r>
-        <w:t xml:space="preserve"> </w:t>
-      </w:r>
-      <w:r>
-        <w:t xml:space="preserve">Bar</w:t>
-      </w:r>
-      <w:r>
-        <w:t xml:space="preserve"> </w:t>
-      </w:r>
-      <w:r>
-        <w:t xml:space="preserve">No.</w:t>
-      </w:r>
-      <w:r>
-        <w:t xml:space="preserve"> </w:t>
-      </w:r>
-      <w:r>
-        <w:t xml:space="preserve">573552</w:t>
-      </w:r>
-    </w:p>
-    <w:p>
-      <w:pPr>
-        <w:keepNext/>
-        <w:keepLines/>
-        <w:spacing w:before="160" w:after="0" w:line="322" w:lineRule="exact"/>
-        <w:ind w:left="4608" w:firstLine="0"/>
-      </w:pPr>
-      <w:r>
-        <w:rPr>
-          <w:i/>
-          <w:iCs/>
-        </w:rPr>
-        <w:t xml:space="preserve">Attorneys</w:t>
-      </w:r>
-      <w:r>
-        <w:rPr>
-          <w:i/>
-          <w:iCs/>
-        </w:rPr>
-        <w:t xml:space="preserve"> </w:t>
-      </w:r>
-      <w:r>
-        <w:rPr>
-          <w:i/>
-          <w:iCs/>
-        </w:rPr>
-        <w:t xml:space="preserve">for</w:t>
-      </w:r>
-      <w:r>
-        <w:rPr>
-          <w:i/>
-          <w:iCs/>
-        </w:rPr>
-        <w:t xml:space="preserve"> </w:t>
-      </w:r>
-      <w:r>
-        <w:rPr>
-          <w:i/>
-          <w:iCs/>
-        </w:rPr>
-        <w:t xml:space="preserve">Appellant</w:t>
-      </w:r>
-    </w:p>
-    <w:p>
-      <w:pPr>
-        <w:keepNext/>
-        <w:keepLines/>
-        <w:spacing w:before="0" w:after="0" w:line="322" w:lineRule="exact"/>
-        <w:ind w:left="4608" w:firstLine="0"/>
-      </w:pPr>
-      <w:r>
-        <w:t xml:space="preserve">304</w:t>
-      </w:r>
-      <w:r>
-        <w:t xml:space="preserve"> </w:t>
-      </w:r>
-      <w:r>
-        <w:t xml:space="preserve">N.</w:t>
-      </w:r>
-      <w:r>
-        <w:t xml:space="preserve"> </w:t>
-      </w:r>
-      <w:r>
-        <w:t xml:space="preserve">Ashley</w:t>
-      </w:r>
-      <w:r>
-        <w:t xml:space="preserve"> </w:t>
-      </w:r>
-      <w:r>
-        <w:t xml:space="preserve">St.</w:t>
-      </w:r>
-    </w:p>
-    <w:p>
-      <w:pPr>
-        <w:keepNext/>
-        <w:keepLines/>
-        <w:spacing w:before="0" w:after="0" w:line="322" w:lineRule="exact"/>
-        <w:ind w:left="4608" w:firstLine="0"/>
-      </w:pPr>
-      <w:r>
-        <w:t xml:space="preserve">Valdosta,</w:t>
-      </w:r>
-      <w:r>
-        <w:t xml:space="preserve"> </w:t>
-      </w:r>
-      <w:r>
-        <w:t xml:space="preserve">GA</w:t>
-      </w:r>
-      <w:r>
-        <w:t xml:space="preserve"> </w:t>
-      </w:r>
-      <w:r>
-        <w:t xml:space="preserve">31601</w:t>
-      </w:r>
-    </w:p>
-    <w:p>
-      <w:pPr>
-        <w:keepNext/>
-        <w:keepLines/>
-        <w:spacing w:before="0" w:after="0" w:line="322" w:lineRule="exact"/>
-        <w:ind w:left="4608" w:firstLine="0"/>
-      </w:pPr>
-      <w:r>
-        <w:t xml:space="preserve">(229)</w:t>
-      </w:r>
-      <w:r>
-        <w:t xml:space="preserve"> </w:t>
-      </w:r>
-      <w:r>
-        <w:t xml:space="preserve">588</w:t>
-      </w:r>
-      <w:r>
-        <w:noBreakHyphen/>
-      </w:r>
-      <w:r>
-        <w:t xml:space="preserve">2608</w:t>
-      </w:r>
-    </w:p>
-    <w:p>
-      <w:pPr>
-        <w:keepNext/>
-        <w:keepLines/>
-        <w:spacing w:before="0" w:after="0" w:line="322" w:lineRule="exact"/>
-        <w:ind w:left="4608" w:firstLine="0"/>
-      </w:pPr>
-      <w:r>
-        <w:t xml:space="preserve">petermanlawoffice@yahoo.com</w:t>
-      </w:r>
-    </w:p>
-    <w:p>
-      <w:pPr>
-        <w:keepNext/>
-        <w:keepLines/>
-        <w:spacing w:before="0" w:after="0" w:line="322" w:lineRule="exact"/>
-        <w:ind w:left="4608" w:firstLine="0"/>
-      </w:pPr>
-      <w:r>
-        <w:t xml:space="preserve">mburke.petermanlaw@gmail.com</w:t>
-      </w:r>
-    </w:p>
-    <w:p>
-      <w:pPr>
-        <w:keepLines/>
-        <w:spacing w:before="0" w:after="0" w:line="322" w:lineRule="exact"/>
-        <w:ind w:left="4608" w:firstLine="0"/>
-      </w:pPr>
-      <w:r>
-        <w:t xml:space="preserve">sddelk.petermanlaw@gmail.com</w:t>
-      </w:r>
-    </w:p>
+      </w:pPr>
+    </w:p>
+    <w:tbl>
+      <w:tblPr>
+        <w:tblW w:w="9360" w:type="dxa"/>
+        <w:tblLayout w:type="fixed"/>
+        <w:tblCellMar>
+          <w:top w:w="0" w:type="dxa"/>
+          <w:left w:w="0" w:type="dxa"/>
+          <w:bottom w:w="0" w:type="dxa"/>
+          <w:right w:w="0" w:type="dxa"/>
+        </w:tblCellMar>
+        <w:tblLook w:val="0000" w:firstRow="0" w:lastRow="0" w:firstColumn="0" w:lastColumn="0" w:noHBand="0" w:noVBand="0"/>
+      </w:tblPr>
+      <w:tblGrid>
+        <w:gridCol w:w="9360"/>
+      </w:tblGrid>
+      <w:tr>
+        <w:trPr>
+          <w:cantSplit/>
+        </w:trPr>
+        <w:tc>
+          <w:tcPr>
+            <w:tcW w:w="9360" w:type="dxa"/>
+          </w:tcPr>
+          <w:p>
+            <w:pPr>
+              <w:spacing w:before="0" w:after="0" w:line="644" w:lineRule="exact"/>
+              <w:ind w:left="0" w:firstLine="720"/>
+              <w:jc w:val="left"/>
+            </w:pPr>
+            <w:r>
+              <w:t xml:space="preserve">by</w:t>
+            </w:r>
+            <w:r>
+              <w:t xml:space="preserve"> </w:t>
+            </w:r>
+            <w:r>
+              <w:t xml:space="preserve">sending</w:t>
+            </w:r>
+            <w:r>
+              <w:t xml:space="preserve"> </w:t>
+            </w:r>
+            <w:r>
+              <w:t xml:space="preserve">it</w:t>
+            </w:r>
+            <w:r>
+              <w:t xml:space="preserve"> </w:t>
+            </w:r>
+            <w:r>
+              <w:t xml:space="preserve">via</w:t>
+            </w:r>
+            <w:r>
+              <w:t xml:space="preserve"> </w:t>
+            </w:r>
+            <w:r>
+              <w:t xml:space="preserve">electronic</w:t>
+            </w:r>
+            <w:r>
+              <w:t xml:space="preserve"> </w:t>
+            </w:r>
+            <w:r>
+              <w:t xml:space="preserve">mail</w:t>
+            </w:r>
+            <w:r>
+              <w:t xml:space="preserve"> </w:t>
+            </w:r>
+            <w:r>
+              <w:t xml:space="preserve">to</w:t>
+            </w:r>
+            <w:r>
+              <w:t xml:space="preserve"> </w:t>
+            </w:r>
+            <w:r>
+              <w:t xml:space="preserve">the</w:t>
+            </w:r>
+            <w:r>
+              <w:t xml:space="preserve"> </w:t>
+            </w:r>
+            <w:r>
+              <w:t xml:space="preserve">address</w:t>
+            </w:r>
+            <w:r>
+              <w:t xml:space="preserve"> </w:t>
+            </w:r>
+            <w:r>
+              <w:t xml:space="preserve">above</w:t>
+            </w:r>
+            <w:r>
+              <w:t xml:space="preserve"> </w:t>
+            </w:r>
+            <w:r>
+              <w:t xml:space="preserve">pursuant</w:t>
+            </w:r>
+            <w:r>
+              <w:t xml:space="preserve"> </w:t>
+            </w:r>
+            <w:r>
+              <w:t xml:space="preserve">to</w:t>
+            </w:r>
+            <w:r>
+              <w:t xml:space="preserve"> </w:t>
+            </w:r>
+            <w:r>
+              <w:t xml:space="preserve">agreement</w:t>
+            </w:r>
+            <w:r>
+              <w:t xml:space="preserve"> </w:t>
+            </w:r>
+            <w:r>
+              <w:t xml:space="preserve">of</w:t>
+            </w:r>
+            <w:r>
+              <w:t xml:space="preserve"> </w:t>
+            </w:r>
+            <w:r>
+              <w:t xml:space="preserve">counsel.</w:t>
+            </w:r>
+            <w:r>
+              <w:t xml:space="preserve"> </w:t>
+            </w:r>
+            <w:r>
+              <w:t xml:space="preserve">I</w:t>
+            </w:r>
+            <w:r>
+              <w:t xml:space="preserve"> </w:t>
+            </w:r>
+            <w:r>
+              <w:t xml:space="preserve">certify</w:t>
+            </w:r>
+            <w:r>
+              <w:t xml:space="preserve"> </w:t>
+            </w:r>
+            <w:r>
+              <w:t xml:space="preserve">that</w:t>
+            </w:r>
+            <w:r>
+              <w:t xml:space="preserve"> </w:t>
+            </w:r>
+            <w:r>
+              <w:t xml:space="preserve">there</w:t>
+            </w:r>
+            <w:r>
+              <w:t xml:space="preserve"> </w:t>
+            </w:r>
+            <w:r>
+              <w:t xml:space="preserve">is</w:t>
+            </w:r>
+            <w:r>
+              <w:t xml:space="preserve"> </w:t>
+            </w:r>
+            <w:r>
+              <w:t xml:space="preserve">a</w:t>
+            </w:r>
+            <w:r>
+              <w:t xml:space="preserve"> </w:t>
+            </w:r>
+            <w:r>
+              <w:t xml:space="preserve">prior</w:t>
+            </w:r>
+            <w:r>
+              <w:t xml:space="preserve"> </w:t>
+            </w:r>
+            <w:r>
+              <w:t xml:space="preserve">agreement</w:t>
+            </w:r>
+            <w:r>
+              <w:t xml:space="preserve"> </w:t>
+            </w:r>
+            <w:r>
+              <w:t xml:space="preserve">with</w:t>
+            </w:r>
+            <w:r>
+              <w:t xml:space="preserve"> </w:t>
+            </w:r>
+            <w:r>
+              <w:t xml:space="preserve">YOUNG,</w:t>
+            </w:r>
+            <w:r>
+              <w:t xml:space="preserve"> </w:t>
+            </w:r>
+            <w:r>
+              <w:t xml:space="preserve">THAGARD,</w:t>
+            </w:r>
+            <w:r>
+              <w:t xml:space="preserve"> </w:t>
+            </w:r>
+            <w:r>
+              <w:t xml:space="preserve">HOFFMAN,</w:t>
+            </w:r>
+            <w:r>
+              <w:t xml:space="preserve"> </w:t>
+            </w:r>
+            <w:r>
+              <w:t xml:space="preserve">LLP</w:t>
+            </w:r>
+            <w:r>
+              <w:t xml:space="preserve"> </w:t>
+            </w:r>
+            <w:r>
+              <w:t xml:space="preserve">to</w:t>
+            </w:r>
+            <w:r>
+              <w:t xml:space="preserve"> </w:t>
+            </w:r>
+            <w:r>
+              <w:t xml:space="preserve">allow</w:t>
+            </w:r>
+            <w:r>
+              <w:t xml:space="preserve"> </w:t>
+            </w:r>
+            <w:r>
+              <w:t xml:space="preserve">documents</w:t>
+            </w:r>
+            <w:r>
+              <w:t xml:space="preserve"> </w:t>
+            </w:r>
+            <w:r>
+              <w:t xml:space="preserve">in</w:t>
+            </w:r>
+            <w:r>
+              <w:t xml:space="preserve"> </w:t>
+            </w:r>
+            <w:r>
+              <w:t xml:space="preserve">a</w:t>
+            </w:r>
+            <w:r>
+              <w:t xml:space="preserve"> </w:t>
+            </w:r>
+            <w:r>
+              <w:t xml:space="preserve">PDF</w:t>
+            </w:r>
+            <w:r>
+              <w:t xml:space="preserve"> </w:t>
+            </w:r>
+            <w:r>
+              <w:t xml:space="preserve">format</w:t>
+            </w:r>
+            <w:r>
+              <w:t xml:space="preserve"> </w:t>
+            </w:r>
+            <w:r>
+              <w:t xml:space="preserve">sent</w:t>
+            </w:r>
+            <w:r>
+              <w:t xml:space="preserve"> </w:t>
+            </w:r>
+            <w:r>
+              <w:t xml:space="preserve">via</w:t>
+            </w:r>
+            <w:r>
+              <w:t xml:space="preserve"> </w:t>
+            </w:r>
+            <w:r>
+              <w:t xml:space="preserve">email</w:t>
+            </w:r>
+            <w:r>
+              <w:t xml:space="preserve"> </w:t>
+            </w:r>
+            <w:r>
+              <w:t xml:space="preserve">to</w:t>
+            </w:r>
+            <w:r>
+              <w:t xml:space="preserve"> </w:t>
+            </w:r>
+            <w:r>
+              <w:t xml:space="preserve">suffice</w:t>
+            </w:r>
+            <w:r>
+              <w:t xml:space="preserve"> </w:t>
+            </w:r>
+            <w:r>
+              <w:t xml:space="preserve">for</w:t>
+            </w:r>
+            <w:r>
+              <w:t xml:space="preserve"> </w:t>
+            </w:r>
+            <w:r>
+              <w:t xml:space="preserve">service;</w:t>
+            </w:r>
+            <w:r>
+              <w:t xml:space="preserve"> </w:t>
+            </w:r>
+            <w:r>
+              <w:t xml:space="preserve">and</w:t>
+            </w:r>
+            <w:r>
+              <w:t xml:space="preserve"> </w:t>
+            </w:r>
+            <w:r>
+              <w:t xml:space="preserve">by</w:t>
+            </w:r>
+            <w:r>
+              <w:t xml:space="preserve"> </w:t>
+            </w:r>
+            <w:r>
+              <w:t xml:space="preserve">electronically</w:t>
+            </w:r>
+            <w:r>
+              <w:t xml:space="preserve"> </w:t>
+            </w:r>
+            <w:r>
+              <w:t xml:space="preserve">filing</w:t>
+            </w:r>
+            <w:r>
+              <w:t xml:space="preserve"> </w:t>
+            </w:r>
+            <w:r>
+              <w:t xml:space="preserve">this</w:t>
+            </w:r>
+            <w:r>
+              <w:t xml:space="preserve"> </w:t>
+            </w:r>
+            <w:r>
+              <w:t xml:space="preserve">document,</w:t>
+            </w:r>
+            <w:r>
+              <w:t xml:space="preserve"> </w:t>
+            </w:r>
+            <w:r>
+              <w:t xml:space="preserve">which</w:t>
+            </w:r>
+            <w:r>
+              <w:t xml:space="preserve"> </w:t>
+            </w:r>
+            <w:r>
+              <w:t xml:space="preserve">sends</w:t>
+            </w:r>
+            <w:r>
+              <w:t xml:space="preserve"> </w:t>
+            </w:r>
+            <w:r>
+              <w:t xml:space="preserve">notice</w:t>
+            </w:r>
+            <w:r>
+              <w:t xml:space="preserve"> </w:t>
+            </w:r>
+            <w:r>
+              <w:t xml:space="preserve">via</w:t>
+            </w:r>
+            <w:r>
+              <w:t xml:space="preserve"> </w:t>
+            </w:r>
+            <w:r>
+              <w:t xml:space="preserve">that</w:t>
+            </w:r>
+            <w:r>
+              <w:t xml:space="preserve"> </w:t>
+            </w:r>
+            <w:r>
+              <w:t xml:space="preserve">system</w:t>
+            </w:r>
+            <w:r>
+              <w:t xml:space="preserve"> </w:t>
+            </w:r>
+            <w:r>
+              <w:t xml:space="preserve">to</w:t>
+            </w:r>
+            <w:r>
+              <w:t xml:space="preserve"> </w:t>
+            </w:r>
+            <w:r>
+              <w:t xml:space="preserve">all</w:t>
+            </w:r>
+            <w:r>
+              <w:t xml:space="preserve"> </w:t>
+            </w:r>
+            <w:r>
+              <w:t xml:space="preserve">parties</w:t>
+            </w:r>
+            <w:r>
+              <w:t xml:space="preserve"> </w:t>
+            </w:r>
+            <w:r>
+              <w:t xml:space="preserve">and</w:t>
+            </w:r>
+            <w:r>
+              <w:t xml:space="preserve"> </w:t>
+            </w:r>
+            <w:r>
+              <w:t xml:space="preserve">counsel.</w:t>
+            </w:r>
+            <w:r>
+              <w:t xml:space="preserve"> </w:t>
+            </w:r>
+            <w:r>
+              <w:t xml:space="preserve">This</w:t>
+            </w:r>
+            <w:r>
+              <w:t xml:space="preserve"> </w:t>
+            </w:r>
+            <w:r>
+              <w:t xml:space="preserve">26th</w:t>
+            </w:r>
+            <w:r>
+              <w:t xml:space="preserve"> </w:t>
+            </w:r>
+            <w:r>
+              <w:t xml:space="preserve">day</w:t>
+            </w:r>
+            <w:r>
+              <w:t xml:space="preserve"> </w:t>
+            </w:r>
+            <w:r>
+              <w:t xml:space="preserve">of</w:t>
+            </w:r>
+            <w:r>
+              <w:t xml:space="preserve"> </w:t>
+            </w:r>
+            <w:r>
+              <w:t xml:space="preserve">January</w:t>
+            </w:r>
+            <w:r>
+              <w:t xml:space="preserve"> </w:t>
+            </w:r>
+            <w:r>
+              <w:t xml:space="preserve">2026.</w:t>
+            </w:r>
+          </w:p>
+          <w:p>
+            <w:pPr>
+              <w:spacing w:before="240" w:after="0" w:line="322" w:lineRule="exact"/>
+              <w:ind w:left="4608" w:firstLine="0"/>
+              <w:jc w:val="left"/>
+            </w:pPr>
+            <w:r>
+              <w:rPr>
+                <w:u w:val="single"/>
+              </w:rPr>
+              <w:t xml:space="preserve">/s/</w:t>
+            </w:r>
+            <w:r>
+              <w:rPr>
+                <w:u w:val="single"/>
+              </w:rPr>
+              <w:t xml:space="preserve"> </w:t>
+            </w:r>
+            <w:r>
+              <w:rPr>
+                <w:i/>
+                <w:iCs/>
+                <w:u w:val="single"/>
+              </w:rPr>
+              <w:t xml:space="preserve">Jody</w:t>
+            </w:r>
+            <w:r>
+              <w:rPr>
+                <w:i/>
+                <w:iCs/>
+                <w:u w:val="single"/>
+              </w:rPr>
+              <w:t xml:space="preserve"> </w:t>
+            </w:r>
+            <w:r>
+              <w:rPr>
+                <w:i/>
+                <w:iCs/>
+                <w:u w:val="single"/>
+              </w:rPr>
+              <w:t xml:space="preserve">D.</w:t>
+            </w:r>
+            <w:r>
+              <w:rPr>
+                <w:i/>
+                <w:iCs/>
+                <w:u w:val="single"/>
+              </w:rPr>
+              <w:t xml:space="preserve"> </w:t>
+            </w:r>
+            <w:r>
+              <w:rPr>
+                <w:i/>
+                <w:iCs/>
+                <w:u w:val="single"/>
+              </w:rPr>
+              <w:t xml:space="preserve">Peterman</w:t>
+            </w:r>
+          </w:p>
+          <w:p>
+            <w:pPr>
+              <w:spacing w:before="0" w:after="0" w:line="322" w:lineRule="exact"/>
+              <w:ind w:left="4608" w:firstLine="0"/>
+              <w:jc w:val="left"/>
+            </w:pPr>
+            <w:r>
+              <w:t xml:space="preserve">Jody</w:t>
+            </w:r>
+            <w:r>
+              <w:t xml:space="preserve"> </w:t>
+            </w:r>
+            <w:r>
+              <w:t xml:space="preserve">D.</w:t>
+            </w:r>
+            <w:r>
+              <w:t xml:space="preserve"> </w:t>
+            </w:r>
+            <w:r>
+              <w:t xml:space="preserve">Peterman</w:t>
+            </w:r>
+          </w:p>
+          <w:p>
+            <w:pPr>
+              <w:spacing w:before="0" w:after="0" w:line="322" w:lineRule="exact"/>
+              <w:ind w:left="4608" w:firstLine="0"/>
+              <w:jc w:val="left"/>
+            </w:pPr>
+            <w:r>
+              <w:t xml:space="preserve">Georgia</w:t>
+            </w:r>
+            <w:r>
+              <w:t xml:space="preserve"> </w:t>
+            </w:r>
+            <w:r>
+              <w:t xml:space="preserve">Bar</w:t>
+            </w:r>
+            <w:r>
+              <w:t xml:space="preserve"> </w:t>
+            </w:r>
+            <w:r>
+              <w:t xml:space="preserve">No.</w:t>
+            </w:r>
+            <w:r>
+              <w:t xml:space="preserve"> </w:t>
+            </w:r>
+            <w:r>
+              <w:t xml:space="preserve">573552</w:t>
+            </w:r>
+          </w:p>
+          <w:p>
+            <w:pPr>
+              <w:spacing w:before="240" w:after="0" w:line="322" w:lineRule="exact"/>
+              <w:ind w:left="4608" w:firstLine="0"/>
+              <w:jc w:val="left"/>
+            </w:pPr>
+            <w:r>
+              <w:rPr>
+                <w:u w:val="single"/>
+              </w:rPr>
+              <w:t xml:space="preserve">/s/</w:t>
+            </w:r>
+            <w:r>
+              <w:rPr>
+                <w:u w:val="single"/>
+              </w:rPr>
+              <w:t xml:space="preserve"> </w:t>
+            </w:r>
+            <w:r>
+              <w:rPr>
+                <w:i/>
+                <w:iCs/>
+                <w:u w:val="single"/>
+              </w:rPr>
+              <w:t xml:space="preserve">T.</w:t>
+            </w:r>
+            <w:r>
+              <w:rPr>
+                <w:i/>
+                <w:iCs/>
+                <w:u w:val="single"/>
+              </w:rPr>
+              <w:t xml:space="preserve"> </w:t>
+            </w:r>
+            <w:r>
+              <w:rPr>
+                <w:i/>
+                <w:iCs/>
+                <w:u w:val="single"/>
+              </w:rPr>
+              <w:t xml:space="preserve">Michael</w:t>
+            </w:r>
+            <w:r>
+              <w:rPr>
+                <w:i/>
+                <w:iCs/>
+                <w:u w:val="single"/>
+              </w:rPr>
+              <w:t xml:space="preserve"> </w:t>
+            </w:r>
+            <w:r>
+              <w:rPr>
+                <w:i/>
+                <w:iCs/>
+                <w:u w:val="single"/>
+              </w:rPr>
+              <w:t xml:space="preserve">Burke,</w:t>
+            </w:r>
+            <w:r>
+              <w:rPr>
+                <w:i/>
+                <w:iCs/>
+                <w:u w:val="single"/>
+              </w:rPr>
+              <w:t xml:space="preserve"> </w:t>
+            </w:r>
+            <w:r>
+              <w:rPr>
+                <w:i/>
+                <w:iCs/>
+                <w:u w:val="single"/>
+              </w:rPr>
+              <w:t xml:space="preserve">Jr.</w:t>
+            </w:r>
+          </w:p>
+          <w:p>
+            <w:pPr>
+              <w:spacing w:before="0" w:after="0" w:line="322" w:lineRule="exact"/>
+              <w:ind w:left="4608" w:firstLine="0"/>
+              <w:jc w:val="left"/>
+            </w:pPr>
+            <w:r>
+              <w:t xml:space="preserve">T.</w:t>
+            </w:r>
+            <w:r>
+              <w:t xml:space="preserve"> </w:t>
+            </w:r>
+            <w:r>
+              <w:t xml:space="preserve">Michael</w:t>
+            </w:r>
+            <w:r>
+              <w:t xml:space="preserve"> </w:t>
+            </w:r>
+            <w:r>
+              <w:t xml:space="preserve">Burke,</w:t>
+            </w:r>
+            <w:r>
+              <w:t xml:space="preserve"> </w:t>
+            </w:r>
+            <w:r>
+              <w:t xml:space="preserve">Jr.</w:t>
+            </w:r>
+          </w:p>
+          <w:p>
+            <w:pPr>
+              <w:spacing w:before="0" w:after="0" w:line="322" w:lineRule="exact"/>
+              <w:ind w:left="4608" w:firstLine="0"/>
+              <w:jc w:val="left"/>
+            </w:pPr>
+            <w:r>
+              <w:t xml:space="preserve">Georgia</w:t>
+            </w:r>
+            <w:r>
+              <w:t xml:space="preserve"> </w:t>
+            </w:r>
+            <w:r>
+              <w:t xml:space="preserve">Bar</w:t>
+            </w:r>
+            <w:r>
+              <w:t xml:space="preserve"> </w:t>
+            </w:r>
+            <w:r>
+              <w:t xml:space="preserve">No.</w:t>
+            </w:r>
+            <w:r>
+              <w:t xml:space="preserve"> </w:t>
+            </w:r>
+            <w:r>
+              <w:t xml:space="preserve">106106</w:t>
+            </w:r>
+          </w:p>
+          <w:p>
+            <w:pPr>
+              <w:spacing w:before="240" w:after="0" w:line="322" w:lineRule="exact"/>
+              <w:ind w:left="4608" w:firstLine="0"/>
+              <w:jc w:val="left"/>
+            </w:pPr>
+            <w:r>
+              <w:rPr>
+                <w:u w:val="single"/>
+              </w:rPr>
+              <w:t xml:space="preserve">/s/</w:t>
+            </w:r>
+            <w:r>
+              <w:rPr>
+                <w:u w:val="single"/>
+              </w:rPr>
+              <w:t xml:space="preserve"> </w:t>
+            </w:r>
+            <w:r>
+              <w:rPr>
+                <w:i/>
+                <w:iCs/>
+                <w:u w:val="single"/>
+              </w:rPr>
+              <w:t xml:space="preserve">Stephen</w:t>
+            </w:r>
+            <w:r>
+              <w:rPr>
+                <w:i/>
+                <w:iCs/>
+                <w:u w:val="single"/>
+              </w:rPr>
+              <w:t xml:space="preserve"> </w:t>
+            </w:r>
+            <w:r>
+              <w:rPr>
+                <w:i/>
+                <w:iCs/>
+                <w:u w:val="single"/>
+              </w:rPr>
+              <w:t xml:space="preserve">D.</w:t>
+            </w:r>
+            <w:r>
+              <w:rPr>
+                <w:i/>
+                <w:iCs/>
+                <w:u w:val="single"/>
+              </w:rPr>
+              <w:t xml:space="preserve"> </w:t>
+            </w:r>
+            <w:r>
+              <w:rPr>
+                <w:i/>
+                <w:iCs/>
+                <w:u w:val="single"/>
+              </w:rPr>
+              <w:t xml:space="preserve">Delk</w:t>
+            </w:r>
+          </w:p>
+          <w:p>
+            <w:pPr>
+              <w:spacing w:before="0" w:after="0" w:line="322" w:lineRule="exact"/>
+              <w:ind w:left="4608" w:firstLine="0"/>
+              <w:jc w:val="left"/>
+            </w:pPr>
+            <w:r>
+              <w:t xml:space="preserve">Stephen</w:t>
+            </w:r>
+            <w:r>
+              <w:t xml:space="preserve"> </w:t>
+            </w:r>
+            <w:r>
+              <w:t xml:space="preserve">D.</w:t>
+            </w:r>
+            <w:r>
+              <w:t xml:space="preserve"> </w:t>
+            </w:r>
+            <w:r>
+              <w:t xml:space="preserve">Delk</w:t>
+            </w:r>
+          </w:p>
+          <w:p>
+            <w:pPr>
+              <w:spacing w:before="0" w:after="0" w:line="322" w:lineRule="exact"/>
+              <w:ind w:left="4608" w:firstLine="0"/>
+              <w:jc w:val="left"/>
+            </w:pPr>
+            <w:r>
+              <w:t xml:space="preserve">Georgia</w:t>
+            </w:r>
+            <w:r>
+              <w:t xml:space="preserve"> </w:t>
+            </w:r>
+            <w:r>
+              <w:t xml:space="preserve">Bar</w:t>
+            </w:r>
+            <w:r>
+              <w:t xml:space="preserve"> </w:t>
+            </w:r>
+            <w:r>
+              <w:t xml:space="preserve">No.</w:t>
+            </w:r>
+            <w:r>
+              <w:t xml:space="preserve"> </w:t>
+            </w:r>
+            <w:r>
+              <w:t xml:space="preserve">448395</w:t>
+            </w:r>
+          </w:p>
+          <w:p>
+            <w:pPr>
+              <w:spacing w:before="160" w:after="0" w:line="322" w:lineRule="exact"/>
+              <w:ind w:left="4608" w:firstLine="0"/>
+              <w:jc w:val="left"/>
+            </w:pPr>
+            <w:r>
+              <w:rPr>
+                <w:i/>
+                <w:iCs/>
+              </w:rPr>
+              <w:t xml:space="preserve">Attorneys</w:t>
+            </w:r>
+            <w:r>
+              <w:rPr>
+                <w:i/>
+                <w:iCs/>
+              </w:rPr>
+              <w:t xml:space="preserve"> </w:t>
+            </w:r>
+            <w:r>
+              <w:rPr>
+                <w:i/>
+                <w:iCs/>
+              </w:rPr>
+              <w:t xml:space="preserve">for</w:t>
+            </w:r>
+            <w:r>
+              <w:rPr>
+                <w:i/>
+                <w:iCs/>
+              </w:rPr>
+              <w:t xml:space="preserve"> </w:t>
+            </w:r>
+            <w:r>
+              <w:rPr>
+                <w:i/>
+                <w:iCs/>
+              </w:rPr>
+              <w:t xml:space="preserve">Appellant</w:t>
+            </w:r>
+          </w:p>
+          <w:p>
+            <w:pPr>
+              <w:spacing w:before="0" w:after="0" w:line="322" w:lineRule="exact"/>
+              <w:ind w:left="4608" w:firstLine="0"/>
+              <w:jc w:val="left"/>
+            </w:pPr>
+            <w:r>
+              <w:t xml:space="preserve">304</w:t>
+            </w:r>
+            <w:r>
+              <w:t xml:space="preserve"> </w:t>
+            </w:r>
+            <w:r>
+              <w:t xml:space="preserve">N.</w:t>
+            </w:r>
+            <w:r>
+              <w:t xml:space="preserve"> </w:t>
+            </w:r>
+            <w:r>
+              <w:t xml:space="preserve">Ashley</w:t>
+            </w:r>
+            <w:r>
+              <w:t xml:space="preserve"> </w:t>
+            </w:r>
+            <w:r>
+              <w:t xml:space="preserve">St.</w:t>
+            </w:r>
+          </w:p>
+          <w:p>
+            <w:pPr>
+              <w:spacing w:before="0" w:after="0" w:line="322" w:lineRule="exact"/>
+              <w:ind w:left="4608" w:firstLine="0"/>
+              <w:jc w:val="left"/>
+            </w:pPr>
+            <w:r>
+              <w:t xml:space="preserve">Valdosta,</w:t>
+            </w:r>
+            <w:r>
+              <w:t xml:space="preserve"> </w:t>
+            </w:r>
+            <w:r>
+              <w:t xml:space="preserve">GA</w:t>
+            </w:r>
+            <w:r>
+              <w:t xml:space="preserve"> </w:t>
+            </w:r>
+            <w:r>
+              <w:t xml:space="preserve">31601</w:t>
+            </w:r>
+          </w:p>
+          <w:p>
+            <w:pPr>
+              <w:spacing w:before="0" w:after="0" w:line="322" w:lineRule="exact"/>
+              <w:ind w:left="4608" w:firstLine="0"/>
+              <w:jc w:val="left"/>
+            </w:pPr>
+            <w:r>
+              <w:t xml:space="preserve">(229)</w:t>
+            </w:r>
+            <w:r>
+              <w:t xml:space="preserve"> </w:t>
+            </w:r>
+            <w:r>
+              <w:t xml:space="preserve">588</w:t>
+              <w:noBreakHyphen/>
+              <w:t xml:space="preserve">2608</w:t>
+            </w:r>
+          </w:p>
+          <w:p>
+            <w:pPr>
+              <w:spacing w:before="0" w:after="0" w:line="322" w:lineRule="exact"/>
+              <w:ind w:left="4608" w:firstLine="0"/>
+              <w:jc w:val="left"/>
+            </w:pPr>
+            <w:r>
+              <w:t xml:space="preserve">petermanlawoffice@yahoo.com</w:t>
+            </w:r>
+          </w:p>
+          <w:p>
+            <w:pPr>
+              <w:spacing w:before="0" w:after="0" w:line="322" w:lineRule="exact"/>
+              <w:ind w:left="4608" w:firstLine="0"/>
+              <w:jc w:val="left"/>
+            </w:pPr>
+            <w:r>
+              <w:t xml:space="preserve">mburke.petermanlaw@gmail.com</w:t>
+            </w:r>
+          </w:p>
+          <w:p>
+            <w:pPr>
+              <w:spacing w:before="0" w:after="0" w:line="322" w:lineRule="exact"/>
+              <w:ind w:left="4608" w:firstLine="0"/>
+              <w:jc w:val="left"/>
+            </w:pPr>
+            <w:r>
+              <w:t xml:space="preserve">sddelk.petermanlaw@gmail.com</w:t>
+            </w:r>
+          </w:p>
+        </w:tc>
+      </w:tr>
+    </w:tbl>
     <w:sectPr>
-      <w:footerReference w:type="default" r:id="rIdGaFtr"/>
+      <w:footerReference w:type="default" r:id="rIdXdPage"/>
       <w:pgSz w:w="12240" w:h="15840"/>
-      <w:pgMar w:top="1440" w:right="1440" w:bottom="1440" w:left="1440" w:header="720" w:footer="720" w:gutter="0"/>
-      <w:pgNumType w:fmt="decimal" w:start="1"/>
+      <w:pgMar w:top="1440" w:right="1440" w:bottom="1440" w:left="1440" w:header="720" w:footer="686" w:gutter="0"/>
     </w:sectPr>
   </w:body>
 </w:document>
@@ -5889,6 +6221,7 @@
 <w:ftr xmlns:w="http://schemas.openxmlformats.org/wordprocessingml/2006/main" xmlns:r="http://schemas.openxmlformats.org/officeDocument/2006/relationships">
   <w:p>
     <w:pPr>
+      <w:spacing w:before="0" w:after="0" w:line="322" w:lineRule="exact"/>
       <w:jc w:val="center"/>
     </w:pPr>
     <w:r>
@@ -5974,7 +6307,6 @@
   <w:p>
     <w:pPr>
       <w:spacing w:before="0" w:after="0" w:line="322" w:lineRule="exact"/>
-      <w:ind w:firstLine="0"/>
       <w:jc w:val="center"/>
     </w:pPr>
     <w:r>
@@ -5992,6 +6324,17 @@
     <w:r>
       <w:fldChar w:fldCharType="end"/>
     </w:r>
+  </w:p>
+</w:ftr>
+</file>
+
+<file path=word/ftr-own2.xml><?xml version="1.0" encoding="utf-8"?>
+<w:ftr xmlns:w="http://schemas.openxmlformats.org/wordprocessingml/2006/main" xmlns:r="http://schemas.openxmlformats.org/officeDocument/2006/relationships">
+  <w:p>
+    <w:pPr>
+      <w:spacing w:before="0" w:after="0" w:line="322" w:lineRule="exact"/>
+      <w:jc w:val="center"/>
+    </w:pPr>
   </w:p>
 </w:ftr>
 </file>
@@ -6642,7 +6985,7 @@
     <w:unhideWhenUsed/>
     <w:qFormat/>
     <w:pPr>
-      <w:spacing w:before="322" w:after="322" w:line="322" w:lineRule="exact"/>
+      <w:spacing w:before="280" w:after="280" w:line="322" w:lineRule="exact"/>
       <w:ind w:firstLine="0" w:left="720" w:right="720"/>
     </w:pPr>
   </w:style>
@@ -6670,7 +7013,7 @@
     <w:unhideWhenUsed/>
     <w:qFormat/>
     <w:pPr>
-      <w:spacing w:before="322" w:after="322"/>
+      <w:spacing w:before="280" w:after="280"/>
       <w:ind w:firstLine="0" w:left="720" w:right="720"/>
     </w:pPr>
   </w:style>
@@ -6799,6 +7142,150 @@
       <w:bCs w:val="0"/>
       <w:color w:val="365F91" w:themeColor="accent1" w:themeShade="BF"/>
     </w:rPr>
+  </w:style>
+  <w:style w:type="paragraph" w:customStyle="1" w:styleId="BodyTextNote">
+    <w:name w:val="Body Text Note"/>
+    <w:basedOn w:val="BodyText"/>
+    <w:qFormat/>
+    <w:pPr>
+      <w:widowControl w:val="0"/>
+    </w:pPr>
+  </w:style>
+  <w:style w:type="paragraph" w:customStyle="1" w:styleId="XdQuote">
+    <w:name w:val="Xd Quote"/>
+    <w:basedOn w:val="Normal"/>
+    <w:qFormat/>
+    <w:pPr>
+      <w:spacing w:before="322" w:after="322" w:line="322" w:lineRule="exact"/>
+      <w:ind w:left="720" w:right="720" w:firstLine="0"/>
+    </w:pPr>
+  </w:style>
+  <w:style w:type="paragraph" w:customStyle="1" w:styleId="XdQuoteFirst">
+    <w:name w:val="Xd Quote First"/>
+    <w:basedOn w:val="Normal"/>
+    <w:qFormat/>
+    <w:pPr>
+      <w:spacing w:before="322" w:after="322" w:line="322" w:lineRule="exact"/>
+      <w:ind w:left="720" w:right="720" w:firstLine="0"/>
+    </w:pPr>
+  </w:style>
+  <w:style w:type="paragraph" w:customStyle="1" w:styleId="XdQuoteLast">
+    <w:name w:val="Xd Quote Last"/>
+    <w:basedOn w:val="Normal"/>
+    <w:qFormat/>
+    <w:pPr>
+      <w:spacing w:before="322" w:after="322" w:line="322" w:lineRule="exact"/>
+      <w:ind w:left="720" w:right="720" w:firstLine="0"/>
+    </w:pPr>
+  </w:style>
+  <w:style w:type="paragraph" w:customStyle="1" w:styleId="XdQuoteOnly">
+    <w:name w:val="Xd Quote Only"/>
+    <w:basedOn w:val="Normal"/>
+    <w:qFormat/>
+    <w:pPr>
+      <w:spacing w:before="322" w:after="322" w:line="322" w:lineRule="exact"/>
+      <w:ind w:left="720" w:right="720" w:firstLine="0"/>
+    </w:pPr>
+  </w:style>
+  <w:style w:type="paragraph" w:customStyle="1" w:styleId="XdTail">
+    <w:name w:val="Xd Tail"/>
+    <w:basedOn w:val="Normal"/>
+    <w:qFormat/>
+    <w:pPr>
+      <w:spacing w:before="0" w:after="0" w:line="322" w:lineRule="exact"/>
+      <w:ind w:firstLine="0"/>
+    </w:pPr>
+  </w:style>
+  <w:style w:type="paragraph" w:customStyle="1" w:styleId="XdList1">
+    <w:name w:val="XdList 1"/>
+    <w:basedOn w:val="Normal"/>
+    <w:qFormat/>
+    <w:pPr>
+      <w:spacing w:before="0" w:after="0" w:line="644" w:lineRule="exact"/>
+      <w:ind w:left="720" w:hanging="720"/>
+    </w:pPr>
+  </w:style>
+  <w:style w:type="paragraph" w:customStyle="1" w:styleId="XdList2">
+    <w:name w:val="XdList 2"/>
+    <w:basedOn w:val="Normal"/>
+    <w:qFormat/>
+    <w:pPr>
+      <w:spacing w:before="0" w:after="0" w:line="644" w:lineRule="exact"/>
+      <w:ind w:left="1440" w:hanging="720"/>
+    </w:pPr>
+  </w:style>
+  <w:style w:type="paragraph" w:customStyle="1" w:styleId="XdList3">
+    <w:name w:val="XdList 3"/>
+    <w:basedOn w:val="Normal"/>
+    <w:qFormat/>
+    <w:pPr>
+      <w:spacing w:before="0" w:after="0" w:line="644" w:lineRule="exact"/>
+      <w:ind w:left="2160" w:hanging="720"/>
+    </w:pPr>
+  </w:style>
+  <w:style w:type="paragraph" w:customStyle="1" w:styleId="XdTailList1">
+    <w:name w:val="XdTailList 1"/>
+    <w:basedOn w:val="Normal"/>
+    <w:qFormat/>
+    <w:pPr>
+      <w:spacing w:before="0" w:after="0" w:line="322" w:lineRule="exact"/>
+      <w:ind w:left="720" w:hanging="720"/>
+    </w:pPr>
+  </w:style>
+  <w:style w:type="paragraph" w:customStyle="1" w:styleId="XdTailList2">
+    <w:name w:val="XdTailList 2"/>
+    <w:basedOn w:val="Normal"/>
+    <w:qFormat/>
+    <w:pPr>
+      <w:spacing w:before="0" w:after="0" w:line="322" w:lineRule="exact"/>
+      <w:ind w:left="1440" w:hanging="720"/>
+    </w:pPr>
+  </w:style>
+  <w:style w:type="paragraph" w:customStyle="1" w:styleId="XdTailList3">
+    <w:name w:val="XdTailList 3"/>
+    <w:basedOn w:val="Normal"/>
+    <w:qFormat/>
+    <w:pPr>
+      <w:spacing w:before="0" w:after="0" w:line="322" w:lineRule="exact"/>
+      <w:ind w:left="2160" w:hanging="720"/>
+    </w:pPr>
+  </w:style>
+  <w:style w:type="paragraph" w:customStyle="1" w:styleId="XdQuoteList1">
+    <w:name w:val="Xd Quote List 1"/>
+    <w:basedOn w:val="Normal"/>
+    <w:qFormat/>
+    <w:pPr>
+      <w:spacing w:before="0" w:after="0" w:line="322" w:lineRule="exact"/>
+      <w:ind w:left="1440" w:right="720" w:hanging="720"/>
+    </w:pPr>
+  </w:style>
+  <w:style w:type="paragraph" w:customStyle="1" w:styleId="XdQuoteList2">
+    <w:name w:val="Xd Quote List 2"/>
+    <w:basedOn w:val="Normal"/>
+    <w:qFormat/>
+    <w:pPr>
+      <w:spacing w:before="0" w:after="0" w:line="322" w:lineRule="exact"/>
+      <w:ind w:left="2160" w:right="720" w:hanging="720"/>
+    </w:pPr>
+  </w:style>
+  <w:style w:type="paragraph" w:customStyle="1" w:styleId="XdQuoteList3">
+    <w:name w:val="Xd Quote List 3"/>
+    <w:basedOn w:val="Normal"/>
+    <w:qFormat/>
+    <w:pPr>
+      <w:spacing w:before="0" w:after="0" w:line="322" w:lineRule="exact"/>
+      <w:ind w:left="2880" w:right="720" w:hanging="720"/>
+    </w:pPr>
+  </w:style>
+  <w:style w:type="paragraph" w:customStyle="1" w:styleId="XdQuoteFirst">
+    <w:name w:val="XdQuoteFirst"/>
+    <w:basedOn w:val="BodyText"/>
+    <w:qFormat/>
+  </w:style>
+  <w:style w:type="paragraph" w:customStyle="1" w:styleId="XdQuoteLast">
+    <w:name w:val="XdQuoteLast"/>
+    <w:basedOn w:val="BodyText"/>
+    <w:qFormat/>
   </w:style>
   <w:style w:type="paragraph" w:customStyle="1" w:styleId="SourceCode">
     <w:name w:val="Source Code"/>

</xml_diff>